<commit_message>
Add Section Seven: The Britain and Israel Model - proactive intelligence to nip threats in the bud (CONTEST/JTAC/Prevent + Israeli collaborative fusion doctrine). Renumbered all subsequent sections across script, HTML canvas (29->30 slides) and PPTX (29->30 slides). Added new Harvard-style references (HM Government CONTEST 2023, UK Home Office Prevent Duty 2023, Byman 2011, Israel Security Agency 2024).
</commit_message>
<xml_diff>
--- a/avm_morgan_docs/AVM_MORGAN_SECURITY_KEYNOTE_ADDRESS_V4_MOD_AUG31.docx
+++ b/avm_morgan_docs/AVM_MORGAN_SECURITY_KEYNOTE_ADDRESS_V4_MOD_AUG31.docx
@@ -384,13 +384,48 @@
     <w:p>
       <w:pPr>
         <w:pStyle w:val="Heading1"/>
-        <w:spacing w:after="150" w:before="300"/>
-      </w:pPr>
-      <w:r>
-        <w:rPr>
-          <w:sz w:val="32"/>
-        </w:rPr>
-        <w:t xml:space="preserve">SECTION SEVEN: THE COMMUNITY MUST BECOME THE FIRST SENSOR</w:t>
+      </w:pPr>
+      <w:r>
+        <w:t>SECTION SEVEN: THE BRITAIN AND ISRAEL MODEL — PROACTIVE INTELLIGENCE TO NIP THREATS IN THE BUD</w:t>
+      </w:r>
+    </w:p>
+    <w:p>
+      <w:pPr/>
+      <w:r>
+        <w:t>Let me turn now to two proven models of proactive intelligence, because North-Central Nigeria does not need to invent this from nothing. We need to adapt lessons already paid for, in blood, elsewhere.</w:t>
+      </w:r>
+    </w:p>
+    <w:p>
+      <w:pPr/>
+      <w:r>
+        <w:t>Britain's approach, refined since the Provisional IRA campaign and hardened further after the 7 July 2005 London bombings, rests on four pillars it calls Prevent, Pursue, Protect, and Prepare. Prevent stops people becoming terrorists or supporting terrorism in the first place, through community-embedded policing and early safeguarding referral — years before an attack is even planned, not after it. Pursue investigates and disrupts. The Joint Terrorism Analysis Centre I mentioned a moment ago is the fusion engine behind all four pillars, turning fragmented reporting into one continuously updated threat picture.</w:t>
+      </w:r>
+    </w:p>
+    <w:p>
+      <w:pPr/>
+      <w:r>
+        <w:t>Israel's approach, born of permanent existential threat, pushes speed and integration even further. Military intelligence, domestic security, police, border authorities, technology platforms, and — critically — ordinary communities are fused into a single collaborative intelligence system. The philosophy is simple: discover a threat early, fuse the information, share it in real time with whoever can act on it, decide collectively, and act lawfully before the threat matures into violence. Communities detect unusual movement, strangers, and changed behaviour long before any distant headquarters does. That local information is corroborated and converted into actionable intelligence, and after every operation, what is learned feeds straight back into the system.</w:t>
+      </w:r>
+    </w:p>
+    <w:p>
+      <w:pPr/>
+      <w:r>
+        <w:t>Britain teaches us prevention through community trust and legal safeguarding. Israel teaches us speed, fusion, and the discipline of acting on intelligence before it decays. North-Central Nigeria needs both instincts operating together: nip the threat in the bud, before it costs a single life.</w:t>
+      </w:r>
+    </w:p>
+    <w:p>
+      <w:pPr/>
+    </w:p>
+    <w:p>
+      <w:pPr>
+        <w:pStyle w:val="Heading1"/>
+        <w:spacing w:after="150" w:before="300"/>
+      </w:pPr>
+      <w:r>
+        <w:rPr>
+          <w:sz w:val="32"/>
+        </w:rPr>
+        <w:t>SECTION EIGHT: THE COMMUNITY MUST BECOME THE FIRST SENSOR</w:t>
       </w:r>
     </w:p>
     <w:p>
@@ -433,7 +468,7 @@
         <w:rPr>
           <w:sz w:val="32"/>
         </w:rPr>
-        <w:t xml:space="preserve">SECTION EIGHT: TRADITIONAL RULERS IN THE SECURITY ARCHITECTURE</w:t>
+        <w:t>SECTION NINE: TRADITIONAL RULERS IN THE SECURITY ARCHITECTURE</w:t>
       </w:r>
     </w:p>
     <w:p>
@@ -463,7 +498,7 @@
         <w:rPr>
           <w:sz w:val="32"/>
         </w:rPr>
-        <w:t xml:space="preserve">SECTION NINE: SECURITY CORRIDORS, NOT ADMINISTRATIVE BOUNDARIES</w:t>
+        <w:t>SECTION TEN: SECURITY CORRIDORS, NOT ADMINISTRATIVE BOUNDARIES</w:t>
       </w:r>
     </w:p>
     <w:p>
@@ -493,7 +528,7 @@
         <w:rPr>
           <w:sz w:val="32"/>
         </w:rPr>
-        <w:t xml:space="preserve">SECTION TEN: RAPID RESPONSE — THE THIRTY TO SIXTY MINUTE WINDOW</w:t>
+        <w:t>SECTION ELEVEN: RAPID RESPONSE — THE THIRTY TO SIXTY MINUTE WINDOW</w:t>
       </w:r>
     </w:p>
     <w:p>
@@ -523,7 +558,7 @@
         <w:rPr>
           <w:sz w:val="32"/>
         </w:rPr>
-        <w:t xml:space="preserve">SECTION ELEVEN: TECHNOLOGY SHOULD MULTIPLY HUMAN CAPABILITY</w:t>
+        <w:t>SECTION TWELVE: TECHNOLOGY SHOULD MULTIPLY HUMAN CAPABILITY</w:t>
       </w:r>
     </w:p>
     <w:p>
@@ -553,7 +588,7 @@
         <w:rPr>
           <w:sz w:val="32"/>
         </w:rPr>
-        <w:t xml:space="preserve">SECTION TWELVE: THE FOREST PROBLEM</w:t>
+        <w:t>SECTION THIRTEEN: THE FOREST PROBLEM</w:t>
       </w:r>
     </w:p>
     <w:p>
@@ -583,7 +618,7 @@
         <w:rPr>
           <w:sz w:val="32"/>
         </w:rPr>
-        <w:t xml:space="preserve">SECTION THIRTEEN: SEPARATE THE CRIMINAL FROM THE COMMUNITY</w:t>
+        <w:t>SECTION FOURTEEN: SEPARATE THE CRIMINAL FROM THE COMMUNITY</w:t>
       </w:r>
     </w:p>
     <w:p>
@@ -613,7 +648,7 @@
         <w:rPr>
           <w:sz w:val="32"/>
         </w:rPr>
-        <w:t xml:space="preserve">SECTION FOURTEEN: FARMER-HERDER CONFLICT AS A GOVERNANCE ISSUE</w:t>
+        <w:t>SECTION FIFTEEN: FARMER-HERDER CONFLICT AS A GOVERNANCE ISSUE</w:t>
       </w:r>
     </w:p>
     <w:p>
@@ -643,7 +678,7 @@
         <w:rPr>
           <w:sz w:val="32"/>
         </w:rPr>
-        <w:t xml:space="preserve">SECTION FIFTEEN: YOUNG PEOPLE — THE MOST IMPORTANT LONG-TERM INVESTMENT</w:t>
+        <w:t>SECTION SIXTEEN: YOUNG PEOPLE — THE MOST IMPORTANT LONG-TERM INVESTMENT</w:t>
       </w:r>
     </w:p>
     <w:p>
@@ -673,7 +708,7 @@
         <w:rPr>
           <w:sz w:val="32"/>
         </w:rPr>
-        <w:t xml:space="preserve">SECTIONS SIXTEEN AND SEVENTEEN: WOMEN AS SECURITY PARTNERS, AND THE ROLE OF LOCAL GOVERNMENT</w:t>
+        <w:t>SECTIONS SEVENTEEN AND EIGHTEEN: WOMEN AS SECURITY PARTNERS, AND THE ROLE OF LOCAL GOVERNMENT</w:t>
       </w:r>
     </w:p>
     <w:p>
@@ -703,7 +738,7 @@
         <w:rPr>
           <w:sz w:val="32"/>
         </w:rPr>
-        <w:t xml:space="preserve">SECTION EIGHTEEN: STATE POLICE — AN OPPORTUNITY THAT REQUIRES SAFEGUARDS</w:t>
+        <w:t>SECTION NINETEEN: STATE POLICE — AN OPPORTUNITY THAT REQUIRES SAFEGUARDS</w:t>
       </w:r>
     </w:p>
     <w:p>
@@ -733,7 +768,7 @@
         <w:rPr>
           <w:sz w:val="32"/>
         </w:rPr>
-        <w:t xml:space="preserve">SECTIONS NINETEEN AND TWENTY: PREDICTABLE FUNDING AND PERSONNEL WELFARE</w:t>
+        <w:t>SECTIONS TWENTY AND TWENTY-ONE: PREDICTABLE FUNDING AND PERSONNEL WELFARE</w:t>
       </w:r>
     </w:p>
     <w:p>
@@ -763,7 +798,7 @@
         <w:rPr>
           <w:sz w:val="32"/>
         </w:rPr>
-        <w:t xml:space="preserve">SECTION TWENTY-ONE: THE THREE-LAYER SECURITY MODEL</w:t>
+        <w:t>SECTION TWENTY-TWO: THE THREE-LAYER SECURITY MODEL</w:t>
       </w:r>
     </w:p>
     <w:p>
@@ -793,7 +828,7 @@
         <w:rPr>
           <w:sz w:val="32"/>
         </w:rPr>
-        <w:t xml:space="preserve">SECTION TWENTY-TWO: A TWENTY-FOUR-HOUR SECURITY CYCLE</w:t>
+        <w:t>SECTION TWENTY-THREE: A TWENTY-FOUR-HOUR SECURITY CYCLE</w:t>
       </w:r>
     </w:p>
     <w:p>
@@ -823,7 +858,7 @@
         <w:rPr>
           <w:sz w:val="32"/>
         </w:rPr>
-        <w:t xml:space="preserve">SECTION TWENTY-THREE: WHAT SHOULD HAPPEN IN THE NEXT NINETY DAYS</w:t>
+        <w:t>SECTION TWENTY-FOUR: WHAT SHOULD HAPPEN IN THE NEXT NINETY DAYS</w:t>
       </w:r>
     </w:p>
     <w:p>
@@ -853,7 +888,7 @@
         <w:rPr>
           <w:sz w:val="32"/>
         </w:rPr>
-        <w:t xml:space="preserve">SECTION TWENTY-FOUR: THE NORTH-CENTRAL SECURITY COMPACT — SEVEN COMMITMENTS</w:t>
+        <w:t>SECTION TWENTY-FIVE: THE NORTH-CENTRAL SECURITY COMPACT — SEVEN COMMITMENTS</w:t>
       </w:r>
     </w:p>
     <w:p>
@@ -883,7 +918,7 @@
         <w:rPr>
           <w:sz w:val="32"/>
         </w:rPr>
-        <w:t xml:space="preserve">SECTION TWENTY-FIVE: WHAT SUCCESS SHOULD LOOK LIKE IN THREE YEARS</w:t>
+        <w:t>SECTION TWENTY-SIX: WHAT SUCCESS SHOULD LOOK LIKE IN THREE YEARS</w:t>
       </w:r>
     </w:p>
     <w:p>
@@ -913,7 +948,7 @@
         <w:rPr>
           <w:sz w:val="32"/>
         </w:rPr>
-        <w:t xml:space="preserve">SECTION TWENTY-SIX: THE BIGGEST CHANGE WE NEED IS MENTAL</w:t>
+        <w:t>SECTION TWENTY-SEVEN: THE BIGGEST CHANGE WE NEED IS MENTAL</w:t>
       </w:r>
     </w:p>
     <w:p>
@@ -1011,7 +1046,7 @@
           <w:sz w:val="32"/>
           <w:szCs w:val="24"/>
         </w:rPr>
-        <w:t xml:space="preserve">The historical and comparative examples cited throughout this address draw on the following sources and precedents: the Armed Conflict Location and Event Data Project (ACLED), for conflict and fatality data across Benue, Plateau, and Niger States, January 2024 to December 2025; the Northern Nigerian Security Trust Fund, inaugurated July 2026; Plan Colombia and the associated shift toward community intelligence and reintegration programmes in Colombia through the 1990s and 2000s; the Nyumba Kumi community policing initiative in Kenya; the Barangay Peacekeeping Action Teams of the Philippines; the Joint Terrorism Analysis Centre (JTAC) of the United Kingdom; the National Counterterrorism Center (NCTC) of the United States; the Multi-Agency Centre (MAC) of India, established following the 2008 Mumbai attacks; Israel's civil defence rapid-response and pre-positioning doctrine; youth reintegration programmes following the Good Friday Agreement in Northern Ireland; the ongoing provincial policing powers debate in South Africa; cross-border grazing and pastoralist dialogue initiatives across the Sahel, including the Kenya-Ethiopia grazing corridor agreements; and the North-Central Nigeria Governors' Forum joint security operations agreement of 2025.</w:t>
+        <w:t>The historical and comparative examples cited throughout this address draw on the following sources and precedents: the Armed Conflict Location and Event Data Project (ACLED), for conflict and fatality data across Benue, Plateau, and Niger States, January 2024 to December 2025; the Northern Nigerian Security Trust Fund, inaugurated July 2026; Plan Colombia and the associated shift toward community intelligence and reintegration programmes in Colombia through the 1990s and 2000s; the Nyumba Kumi community policing initiative in Kenya; the Barangay Peacekeeping Action Teams of the Philippines; the Joint Terrorism Analysis Centre (JTAC) of the United Kingdom; the United Kingdom's CONTEST counter-terrorism strategy (Prevent, Pursue, Protect, Prepare); the Prevent Duty guidance issued by the UK Home Office; the National Counterterrorism Center (NCTC) of the United States; the Multi-Agency Centre (MAC) of India, established following the 2008 Mumbai attacks; Israel's collaborative intelligence-fusion doctrine linking military intelligence, domestic security, police, border authorities and community reporting; Israel's civil defence rapid-response and pre-positioning doctrine; youth reintegration programmes following the Good Friday Agreement in Northern Ireland; the ongoing provincial policing powers debate in South Africa; cross-border grazing and pastoralist dialogue initiatives across the Sahel, including the Kenya-Ethiopia grazing corridor agreements; and the North-Central Nigeria Governors' Forum joint security operations agreement of 2025.</w:t>
       </w:r>
     </w:p>
     <w:sectPr>

</xml_diff>

<commit_message>
Expand Section Seven Israel model with Gemini's 4-principle framework (intelligence fusion, real-time sharing, local intelligence, intelligence-to-action cycle) + Nigeria fusion-centre application (Armed Forces/Police/DSS/NIA/NSCDC/community networks). Synced HTML and PPTX slide 10 bullets. Highlighted new Section Seven content and new reference entries in RED text in the DOCX script for easy review.
</commit_message>
<xml_diff>
--- a/avm_morgan_docs/AVM_MORGAN_SECURITY_KEYNOTE_ADDRESS_V4_MOD_AUG31.docx
+++ b/avm_morgan_docs/AVM_MORGAN_SECURITY_KEYNOTE_ADDRESS_V4_MOD_AUG31.docx
@@ -386,30 +386,63 @@
         <w:pStyle w:val="Heading1"/>
       </w:pPr>
       <w:r>
+        <w:rPr>
+          <w:color w:val="FF0000"/>
+        </w:rPr>
         <w:t>SECTION SEVEN: THE BRITAIN AND ISRAEL MODEL — PROACTIVE INTELLIGENCE TO NIP THREATS IN THE BUD</w:t>
       </w:r>
     </w:p>
     <w:p>
       <w:pPr/>
       <w:r>
+        <w:rPr>
+          <w:color w:val="FF0000"/>
+        </w:rPr>
         <w:t>Let me turn now to two proven models of proactive intelligence, because North-Central Nigeria does not need to invent this from nothing. We need to adapt lessons already paid for, in blood, elsewhere.</w:t>
       </w:r>
     </w:p>
     <w:p>
       <w:pPr/>
       <w:r>
+        <w:rPr>
+          <w:color w:val="FF0000"/>
+        </w:rPr>
         <w:t>Britain's approach, refined since the Provisional IRA campaign and hardened further after the 7 July 2005 London bombings, rests on four pillars it calls Prevent, Pursue, Protect, and Prepare. Prevent stops people becoming terrorists or supporting terrorism in the first place, through community-embedded policing and early safeguarding referral — years before an attack is even planned, not after it. Pursue investigates and disrupts. The Joint Terrorism Analysis Centre I mentioned a moment ago is the fusion engine behind all four pillars, turning fragmented reporting into one continuously updated threat picture.</w:t>
       </w:r>
     </w:p>
     <w:p>
       <w:pPr/>
       <w:r>
-        <w:t>Israel's approach, born of permanent existential threat, pushes speed and integration even further. Military intelligence, domestic security, police, border authorities, technology platforms, and — critically — ordinary communities are fused into a single collaborative intelligence system. The philosophy is simple: discover a threat early, fuse the information, share it in real time with whoever can act on it, decide collectively, and act lawfully before the threat matures into violence. Communities detect unusual movement, strangers, and changed behaviour long before any distant headquarters does. That local information is corroborated and converted into actionable intelligence, and after every operation, what is learned feeds straight back into the system.</w:t>
+        <w:rPr>
+          <w:color w:val="FF0000"/>
+        </w:rPr>
+        <w:t>Israel's success against terrorism, infiltration, and organised crime rests on an intelligence philosophy built on collaboration, integration, and speed. Military intelligence, domestic security, police, border authorities, technology platforms, and community reporting are fused into a single system — not compartmentalised agency by agency — so that a threat is identified early, understood collectively, and acted on before it matures into a major incident.</w:t>
       </w:r>
     </w:p>
     <w:p>
       <w:pPr/>
       <w:r>
+        <w:rPr>
+          <w:color w:val="FF0000"/>
+        </w:rPr>
+        <w:t>Four principles drive this. Intelligence fusion: human sources, surveillance, signals intelligence, aerial platforms, and police reports are merged to reveal patterns no single agency would see alone. Real-time sharing: the moment a threat surfaces, whoever can act on it knows immediately — intelligence becomes a shared operational resource, not an institutional possession. Strong local intelligence: communities detect strangers and unusual movement long before any distant headquarters does, and that local reporting, once corroborated, becomes actionable intelligence. And the intelligence-to-action cycle: assess the threat, respond rapidly through the appropriate lawful mechanism, and feed every lesson learned straight back into the system.</w:t>
+      </w:r>
+    </w:p>
+    <w:p>
+      <w:pPr/>
+      <w:r>
+        <w:rPr>
+          <w:color w:val="FF0000"/>
+        </w:rPr>
+        <w:t>For North-Central Nigeria, the application is direct. We should establish regional intelligence fusion centres linking the Armed Forces, the Police, the DSS, the NIA, the NSCDC, state security structures, forest-security personnel, and carefully managed, disciplined community intelligence networks. Drones, lawful communications analysis, and geospatial technology should support this system — never replace the human intelligence at its core.</w:t>
+      </w:r>
+    </w:p>
+    <w:p>
+      <w:pPr/>
+      <w:r>
+        <w:rPr>
+          <w:color w:val="FF0000"/>
+        </w:rPr>
         <w:t>Britain teaches us prevention through community trust and legal safeguarding. Israel teaches us speed, fusion, and the discipline of acting on intelligence before it decays. North-Central Nigeria needs both instincts operating together: nip the threat in the bud, before it costs a single life.</w:t>
       </w:r>
     </w:p>
@@ -1046,7 +1079,33 @@
           <w:sz w:val="32"/>
           <w:szCs w:val="24"/>
         </w:rPr>
-        <w:t>The historical and comparative examples cited throughout this address draw on the following sources and precedents: the Armed Conflict Location and Event Data Project (ACLED), for conflict and fatality data across Benue, Plateau, and Niger States, January 2024 to December 2025; the Northern Nigerian Security Trust Fund, inaugurated July 2026; Plan Colombia and the associated shift toward community intelligence and reintegration programmes in Colombia through the 1990s and 2000s; the Nyumba Kumi community policing initiative in Kenya; the Barangay Peacekeeping Action Teams of the Philippines; the Joint Terrorism Analysis Centre (JTAC) of the United Kingdom; the United Kingdom's CONTEST counter-terrorism strategy (Prevent, Pursue, Protect, Prepare); the Prevent Duty guidance issued by the UK Home Office; the National Counterterrorism Center (NCTC) of the United States; the Multi-Agency Centre (MAC) of India, established following the 2008 Mumbai attacks; Israel's collaborative intelligence-fusion doctrine linking military intelligence, domestic security, police, border authorities and community reporting; Israel's civil defence rapid-response and pre-positioning doctrine; youth reintegration programmes following the Good Friday Agreement in Northern Ireland; the ongoing provincial policing powers debate in South Africa; cross-border grazing and pastoralist dialogue initiatives across the Sahel, including the Kenya-Ethiopia grazing corridor agreements; and the North-Central Nigeria Governors' Forum joint security operations agreement of 2025.</w:t>
+        <w:t xml:space="preserve">The historical and comparative examples cited throughout this address draw on the following sources and precedents: the Armed Conflict Location and Event Data Project (ACLED), for conflict and fatality data across Benue, Plateau, and Niger States, January 2024 to December 2025; the Northern Nigerian Security Trust Fund, inaugurated July 2026; Plan Colombia and the associated shift toward community intelligence and reintegration programmes in Colombia through the 1990s and 2000s; the Nyumba Kumi community policing initiative in Kenya; the Barangay Peacekeeping Action Teams of the Philippines; the Joint Terrorism Analysis Centre (JTAC) of the United Kingdom; </w:t>
+      </w:r>
+      <w:r>
+        <w:rPr>
+          <w:color w:val="FF0000"/>
+          <w:sz w:val="32"/>
+        </w:rPr>
+        <w:t>the United Kingdom's CONTEST counter-terrorism strategy (Prevent, Pursue, Protect, Prepare); the Prevent Duty guidance issued by the UK Home Office;</w:t>
+      </w:r>
+      <w:r>
+        <w:rPr>
+          <w:sz w:val="32"/>
+        </w:rPr>
+        <w:t xml:space="preserve"> the National Counterterrorism Center (NCTC) of the United States; the Multi-Agency Centre (MAC) of India, established following the 2008 Mumbai attacks; </w:t>
+      </w:r>
+      <w:r>
+        <w:rPr>
+          <w:color w:val="FF0000"/>
+          <w:sz w:val="32"/>
+        </w:rPr>
+        <w:t>Israel's collaborative intelligence-fusion doctrine linking military intelligence, domestic security, police, border authorities and community reporting;</w:t>
+      </w:r>
+      <w:r>
+        <w:rPr>
+          <w:sz w:val="32"/>
+        </w:rPr>
+        <w:t xml:space="preserve"> Israel's civil defence rapid-response and pre-positioning doctrine; youth reintegration programmes following the Good Friday Agreement in Northern Ireland; the ongoing provincial policing powers debate in South Africa; cross-border grazing and pastoralist dialogue initiatives across the Sahel, including the Kenya-Ethiopia grazing corridor agreements; and the North-Central Nigeria Governors' Forum joint security operations agreement of 2025.</w:t>
       </w:r>
     </w:p>
     <w:sectPr>

</xml_diff>

<commit_message>
Add bold blue [SLIDE N] labels next to every section heading, the title slide, closing, and references in the script - lets Tom instantly link script section to the matching slide during the live Aug 31 keynote.
</commit_message>
<xml_diff>
--- a/avm_morgan_docs/AVM_MORGAN_SECURITY_KEYNOTE_ADDRESS_V4_MOD_AUG31.docx
+++ b/avm_morgan_docs/AVM_MORGAN_SECURITY_KEYNOTE_ADDRESS_V4_MOD_AUG31.docx
@@ -72,6 +72,14 @@
         </w:rPr>
         <w:t xml:space="preserve">Towards a People-Centred, Intelligence-Led and Sustainable Security Architecture</w:t>
       </w:r>
+      <w:r>
+        <w:rPr>
+          <w:b/>
+          <w:color w:val="1F4E9C"/>
+          <w:sz w:val="24"/>
+        </w:rPr>
+        <w:t xml:space="preserve">   [SLIDE 1]</w:t>
+      </w:r>
     </w:p>
     <w:p>
       <w:pPr>
@@ -107,6 +115,14 @@
         </w:rPr>
         <w:t xml:space="preserve">OPENING: ONE ECOSYSTEM, NOT SEPARATE PROBLEMS</w:t>
       </w:r>
+      <w:r>
+        <w:rPr>
+          <w:b/>
+          <w:color w:val="1F4E9C"/>
+          <w:sz w:val="32"/>
+        </w:rPr>
+        <w:t xml:space="preserve">   [SLIDES 2–3]</w:t>
+      </w:r>
     </w:p>
     <w:p>
       <w:pPr>
@@ -173,6 +189,14 @@
         </w:rPr>
         <w:t xml:space="preserve">SECTION ONE: THE NORTH-CENTRAL SECURITY QUESTION</w:t>
       </w:r>
+      <w:r>
+        <w:rPr>
+          <w:b/>
+          <w:color w:val="1F4E9C"/>
+          <w:sz w:val="32"/>
+        </w:rPr>
+        <w:t xml:space="preserve">   [SLIDE 4]</w:t>
+      </w:r>
     </w:p>
     <w:p>
       <w:pPr>
@@ -216,6 +240,14 @@
         </w:rPr>
         <w:t xml:space="preserve">SECTION TWO: THE CENTRAL PROBLEM — WE ARE TOO REACTIVE</w:t>
       </w:r>
+      <w:r>
+        <w:rPr>
+          <w:b/>
+          <w:color w:val="1F4E9C"/>
+          <w:sz w:val="32"/>
+        </w:rPr>
+        <w:t xml:space="preserve">   [SLIDE 5]</w:t>
+      </w:r>
     </w:p>
     <w:p>
       <w:pPr>
@@ -259,6 +291,14 @@
         </w:rPr>
         <w:t xml:space="preserve">SECTION THREE: SECURITY AS COLLECTIVE RESPONSIBILITY</w:t>
       </w:r>
+      <w:r>
+        <w:rPr>
+          <w:b/>
+          <w:color w:val="1F4E9C"/>
+          <w:sz w:val="32"/>
+        </w:rPr>
+        <w:t xml:space="preserve">   [SLIDE 6]</w:t>
+      </w:r>
     </w:p>
     <w:p>
       <w:pPr>
@@ -289,6 +329,14 @@
         </w:rPr>
         <w:t xml:space="preserve">SECTION FOUR: ONE SECURITY PICTURE, MULTIPLE CAPABILITIES</w:t>
       </w:r>
+      <w:r>
+        <w:rPr>
+          <w:b/>
+          <w:color w:val="1F4E9C"/>
+          <w:sz w:val="32"/>
+        </w:rPr>
+        <w:t xml:space="preserve">   [SLIDE 7]</w:t>
+      </w:r>
     </w:p>
     <w:p>
       <w:pPr>
@@ -319,6 +367,14 @@
         </w:rPr>
         <w:t xml:space="preserve">SECTION FIVE: A REGIONAL SECURITY INTELLIGENCE AND FUSION CENTRE</w:t>
       </w:r>
+      <w:r>
+        <w:rPr>
+          <w:b/>
+          <w:color w:val="1F4E9C"/>
+          <w:sz w:val="32"/>
+        </w:rPr>
+        <w:t xml:space="preserve">   [SLIDE 8]</w:t>
+      </w:r>
     </w:p>
     <w:p>
       <w:pPr>
@@ -362,6 +418,14 @@
         </w:rPr>
         <w:t xml:space="preserve">SECTION SIX: FROM INTELLIGENCE COLLECTION TO INTELLIGENCE ACTION</w:t>
       </w:r>
+      <w:r>
+        <w:rPr>
+          <w:b/>
+          <w:color w:val="1F4E9C"/>
+          <w:sz w:val="32"/>
+        </w:rPr>
+        <w:t xml:space="preserve">   [SLIDE 9]</w:t>
+      </w:r>
     </w:p>
     <w:p>
       <w:pPr>
@@ -391,6 +455,14 @@
         </w:rPr>
         <w:t>SECTION SEVEN: THE BRITAIN AND ISRAEL MODEL — PROACTIVE INTELLIGENCE TO NIP THREATS IN THE BUD</w:t>
       </w:r>
+      <w:r>
+        <w:rPr>
+          <w:b/>
+          <w:color w:val="1F4E9C"/>
+          <w:sz w:val="28"/>
+        </w:rPr>
+        <w:t xml:space="preserve">   [SLIDE 10]</w:t>
+      </w:r>
     </w:p>
     <w:p>
       <w:pPr/>
@@ -460,6 +532,14 @@
         </w:rPr>
         <w:t>SECTION EIGHT: THE COMMUNITY MUST BECOME THE FIRST SENSOR</w:t>
       </w:r>
+      <w:r>
+        <w:rPr>
+          <w:b/>
+          <w:color w:val="1F4E9C"/>
+          <w:sz w:val="32"/>
+        </w:rPr>
+        <w:t xml:space="preserve">   [SLIDE 11]</w:t>
+      </w:r>
     </w:p>
     <w:p>
       <w:pPr>
@@ -503,6 +583,14 @@
         </w:rPr>
         <w:t>SECTION NINE: TRADITIONAL RULERS IN THE SECURITY ARCHITECTURE</w:t>
       </w:r>
+      <w:r>
+        <w:rPr>
+          <w:b/>
+          <w:color w:val="1F4E9C"/>
+          <w:sz w:val="32"/>
+        </w:rPr>
+        <w:t xml:space="preserve">   [SLIDE 12]</w:t>
+      </w:r>
     </w:p>
     <w:p>
       <w:pPr>
@@ -533,6 +621,14 @@
         </w:rPr>
         <w:t>SECTION TEN: SECURITY CORRIDORS, NOT ADMINISTRATIVE BOUNDARIES</w:t>
       </w:r>
+      <w:r>
+        <w:rPr>
+          <w:b/>
+          <w:color w:val="1F4E9C"/>
+          <w:sz w:val="32"/>
+        </w:rPr>
+        <w:t xml:space="preserve">   [SLIDE 13]</w:t>
+      </w:r>
     </w:p>
     <w:p>
       <w:pPr>
@@ -563,6 +659,14 @@
         </w:rPr>
         <w:t>SECTION ELEVEN: RAPID RESPONSE — THE THIRTY TO SIXTY MINUTE WINDOW</w:t>
       </w:r>
+      <w:r>
+        <w:rPr>
+          <w:b/>
+          <w:color w:val="1F4E9C"/>
+          <w:sz w:val="32"/>
+        </w:rPr>
+        <w:t xml:space="preserve">   [SLIDE 14]</w:t>
+      </w:r>
     </w:p>
     <w:p>
       <w:pPr>
@@ -593,6 +697,14 @@
         </w:rPr>
         <w:t>SECTION TWELVE: TECHNOLOGY SHOULD MULTIPLY HUMAN CAPABILITY</w:t>
       </w:r>
+      <w:r>
+        <w:rPr>
+          <w:b/>
+          <w:color w:val="1F4E9C"/>
+          <w:sz w:val="32"/>
+        </w:rPr>
+        <w:t xml:space="preserve">   [SLIDE 15]</w:t>
+      </w:r>
     </w:p>
     <w:p>
       <w:pPr>
@@ -623,6 +735,14 @@
         </w:rPr>
         <w:t>SECTION THIRTEEN: THE FOREST PROBLEM</w:t>
       </w:r>
+      <w:r>
+        <w:rPr>
+          <w:b/>
+          <w:color w:val="1F4E9C"/>
+          <w:sz w:val="32"/>
+        </w:rPr>
+        <w:t xml:space="preserve">   [SLIDE 16]</w:t>
+      </w:r>
     </w:p>
     <w:p>
       <w:pPr>
@@ -653,6 +773,14 @@
         </w:rPr>
         <w:t>SECTION FOURTEEN: SEPARATE THE CRIMINAL FROM THE COMMUNITY</w:t>
       </w:r>
+      <w:r>
+        <w:rPr>
+          <w:b/>
+          <w:color w:val="1F4E9C"/>
+          <w:sz w:val="32"/>
+        </w:rPr>
+        <w:t xml:space="preserve">   [SLIDE 17]</w:t>
+      </w:r>
     </w:p>
     <w:p>
       <w:pPr>
@@ -683,6 +811,14 @@
         </w:rPr>
         <w:t>SECTION FIFTEEN: FARMER-HERDER CONFLICT AS A GOVERNANCE ISSUE</w:t>
       </w:r>
+      <w:r>
+        <w:rPr>
+          <w:b/>
+          <w:color w:val="1F4E9C"/>
+          <w:sz w:val="32"/>
+        </w:rPr>
+        <w:t xml:space="preserve">   [SLIDE 18]</w:t>
+      </w:r>
     </w:p>
     <w:p>
       <w:pPr>
@@ -713,6 +849,14 @@
         </w:rPr>
         <w:t>SECTION SIXTEEN: YOUNG PEOPLE — THE MOST IMPORTANT LONG-TERM INVESTMENT</w:t>
       </w:r>
+      <w:r>
+        <w:rPr>
+          <w:b/>
+          <w:color w:val="1F4E9C"/>
+          <w:sz w:val="32"/>
+        </w:rPr>
+        <w:t xml:space="preserve">   [SLIDE 19]</w:t>
+      </w:r>
     </w:p>
     <w:p>
       <w:pPr>
@@ -743,6 +887,14 @@
         </w:rPr>
         <w:t>SECTIONS SEVENTEEN AND EIGHTEEN: WOMEN AS SECURITY PARTNERS, AND THE ROLE OF LOCAL GOVERNMENT</w:t>
       </w:r>
+      <w:r>
+        <w:rPr>
+          <w:b/>
+          <w:color w:val="1F4E9C"/>
+          <w:sz w:val="32"/>
+        </w:rPr>
+        <w:t xml:space="preserve">   [SLIDE 20]</w:t>
+      </w:r>
     </w:p>
     <w:p>
       <w:pPr>
@@ -773,6 +925,14 @@
         </w:rPr>
         <w:t>SECTION NINETEEN: STATE POLICE — AN OPPORTUNITY THAT REQUIRES SAFEGUARDS</w:t>
       </w:r>
+      <w:r>
+        <w:rPr>
+          <w:b/>
+          <w:color w:val="1F4E9C"/>
+          <w:sz w:val="32"/>
+        </w:rPr>
+        <w:t xml:space="preserve">   [SLIDE 21]</w:t>
+      </w:r>
     </w:p>
     <w:p>
       <w:pPr>
@@ -803,6 +963,14 @@
         </w:rPr>
         <w:t>SECTIONS TWENTY AND TWENTY-ONE: PREDICTABLE FUNDING AND PERSONNEL WELFARE</w:t>
       </w:r>
+      <w:r>
+        <w:rPr>
+          <w:b/>
+          <w:color w:val="1F4E9C"/>
+          <w:sz w:val="32"/>
+        </w:rPr>
+        <w:t xml:space="preserve">   [SLIDE 22]</w:t>
+      </w:r>
     </w:p>
     <w:p>
       <w:pPr>
@@ -833,6 +1001,14 @@
         </w:rPr>
         <w:t>SECTION TWENTY-TWO: THE THREE-LAYER SECURITY MODEL</w:t>
       </w:r>
+      <w:r>
+        <w:rPr>
+          <w:b/>
+          <w:color w:val="1F4E9C"/>
+          <w:sz w:val="32"/>
+        </w:rPr>
+        <w:t xml:space="preserve">   [SLIDE 23]</w:t>
+      </w:r>
     </w:p>
     <w:p>
       <w:pPr>
@@ -863,6 +1039,14 @@
         </w:rPr>
         <w:t>SECTION TWENTY-THREE: A TWENTY-FOUR-HOUR SECURITY CYCLE</w:t>
       </w:r>
+      <w:r>
+        <w:rPr>
+          <w:b/>
+          <w:color w:val="1F4E9C"/>
+          <w:sz w:val="32"/>
+        </w:rPr>
+        <w:t xml:space="preserve">   [SLIDE 24]</w:t>
+      </w:r>
     </w:p>
     <w:p>
       <w:pPr>
@@ -893,6 +1077,14 @@
         </w:rPr>
         <w:t>SECTION TWENTY-FOUR: WHAT SHOULD HAPPEN IN THE NEXT NINETY DAYS</w:t>
       </w:r>
+      <w:r>
+        <w:rPr>
+          <w:b/>
+          <w:color w:val="1F4E9C"/>
+          <w:sz w:val="32"/>
+        </w:rPr>
+        <w:t xml:space="preserve">   [SLIDE 25]</w:t>
+      </w:r>
     </w:p>
     <w:p>
       <w:pPr>
@@ -923,6 +1115,14 @@
         </w:rPr>
         <w:t>SECTION TWENTY-FIVE: THE NORTH-CENTRAL SECURITY COMPACT — SEVEN COMMITMENTS</w:t>
       </w:r>
+      <w:r>
+        <w:rPr>
+          <w:b/>
+          <w:color w:val="1F4E9C"/>
+          <w:sz w:val="32"/>
+        </w:rPr>
+        <w:t xml:space="preserve">   [SLIDE 26]</w:t>
+      </w:r>
     </w:p>
     <w:p>
       <w:pPr>
@@ -953,6 +1153,14 @@
         </w:rPr>
         <w:t>SECTION TWENTY-SIX: WHAT SUCCESS SHOULD LOOK LIKE IN THREE YEARS</w:t>
       </w:r>
+      <w:r>
+        <w:rPr>
+          <w:b/>
+          <w:color w:val="1F4E9C"/>
+          <w:sz w:val="32"/>
+        </w:rPr>
+        <w:t xml:space="preserve">   [SLIDE 27]</w:t>
+      </w:r>
     </w:p>
     <w:p>
       <w:pPr>
@@ -983,6 +1191,14 @@
         </w:rPr>
         <w:t>SECTION TWENTY-SEVEN: THE BIGGEST CHANGE WE NEED IS MENTAL</w:t>
       </w:r>
+      <w:r>
+        <w:rPr>
+          <w:b/>
+          <w:color w:val="1F4E9C"/>
+          <w:sz w:val="32"/>
+        </w:rPr>
+        <w:t xml:space="preserve">   [SLIDE 28]</w:t>
+      </w:r>
     </w:p>
     <w:p>
       <w:pPr>
@@ -1012,6 +1228,14 @@
           <w:sz w:val="32"/>
         </w:rPr>
         <w:t xml:space="preserve">CLOSING</w:t>
+      </w:r>
+      <w:r>
+        <w:rPr>
+          <w:b/>
+          <w:color w:val="1F4E9C"/>
+          <w:sz w:val="32"/>
+        </w:rPr>
+        <w:t xml:space="preserve">   [SLIDE 29]</w:t>
       </w:r>
     </w:p>
     <w:p>
@@ -1067,6 +1291,14 @@
           <w:szCs w:val="24"/>
         </w:rPr>
         <w:t xml:space="preserve">REFERENCES</w:t>
+      </w:r>
+      <w:r>
+        <w:rPr>
+          <w:b/>
+          <w:color w:val="1F4E9C"/>
+          <w:sz w:val="32"/>
+        </w:rPr>
+        <w:t xml:space="preserve">   [SLIDE 30]</w:t>
       </w:r>
     </w:p>
     <w:p>

</xml_diff>

<commit_message>
Rebuild Sections 7-10 with full Israeli/UK/NCISRM hybrid model script
</commit_message>
<xml_diff>
--- a/avm_morgan_docs/AVM_MORGAN_SECURITY_KEYNOTE_ADDRESS_V4_MOD_AUG31.docx
+++ b/avm_morgan_docs/AVM_MORGAN_SECURITY_KEYNOTE_ADDRESS_V4_MOD_AUG31.docx
@@ -453,201 +453,555 @@
         <w:rPr>
           <w:color w:val="FF0000"/>
         </w:rPr>
-        <w:t>SECTION SEVEN: THE BRITAIN AND ISRAEL MODEL — PROACTIVE INTELLIGENCE TO NIP THREATS IN THE BUD</w:t>
-      </w:r>
-      <w:r>
-        <w:rPr>
-          <w:b/>
-          <w:color w:val="1F4E9C"/>
-          <w:sz w:val="28"/>
-        </w:rPr>
-        <w:t xml:space="preserve">   [SLIDE 10]</w:t>
-      </w:r>
-    </w:p>
-    <w:p>
-      <w:pPr/>
+        <w:t>SECTION SEVEN: THE ISRAELI MODEL AND THE BRITISH MODEL — TWO LESSONS IN INTEGRATION   [SLIDE 10]</w:t>
+      </w:r>
+    </w:p>
+    <w:p>
       <w:r>
         <w:rPr>
           <w:color w:val="FF0000"/>
         </w:rPr>
-        <w:t>Let me turn now to two proven models of proactive intelligence, because North-Central Nigeria does not need to invent this from nothing. We need to adapt lessons already paid for, in blood, elsewhere.</w:t>
-      </w:r>
-    </w:p>
-    <w:p>
-      <w:pPr/>
+        <w:t>Israel's greatest lesson is not military capability — it is integration. National security is treated as a whole-of-nation responsibility. At the strategic level, the Israeli National Security Council fuses intelligence, political, military, and governmental information into one continuous national assessment, running through a situation room that never stops. At the operational level, the IDF, intelligence organisations, police, emergency agencies, and local authorities are directly connected. Through the Home Front Command, the military maintains continuous relationships with local authorities — running exercises, building local emergency plans, and linking military capability to civilian structures long before any crisis. Israel's chain runs: intelligence, to decision, to command, to local authority, to community, to response. The citizen is not a victim waiting for government. The citizen becomes part of the security architecture.</w:t>
+      </w:r>
+    </w:p>
+    <w:p>
       <w:r>
         <w:rPr>
           <w:color w:val="FF0000"/>
         </w:rPr>
-        <w:t>Britain's approach, refined since the Provisional IRA campaign and hardened further after the 7 July 2005 London bombings, rests on four pillars it calls Prevent, Pursue, Protect, and Prepare. Prevent stops people becoming terrorists or supporting terrorism in the first place, through community-embedded policing and early safeguarding referral — years before an attack is even planned, not after it. Pursue investigates and disrupts. The Joint Terrorism Analysis Centre I mentioned a moment ago is the fusion engine behind all four pillars, turning fragmented reporting into one continuously updated threat picture.</w:t>
-      </w:r>
-    </w:p>
-    <w:p>
-      <w:pPr/>
+        <w:t>From Israel, North-Central Nigeria should borrow five things: permanent intelligence fusion, strong regional operational coordination, military-police-intelligence integration, prepared local authorities, and community participation and resilience. We should not, however, copy Israel's highly militarised security environment wholesale — Nigeria is a larger, more diverse federation with different constitutional and political realities.</w:t>
+      </w:r>
+    </w:p>
+    <w:p>
       <w:r>
         <w:rPr>
           <w:color w:val="FF0000"/>
         </w:rPr>
-        <w:t>Israel's success against terrorism, infiltration, and organised crime rests on an intelligence philosophy built on collaboration, integration, and speed. Military intelligence, domestic security, police, border authorities, technology platforms, and community reporting are fused into a single system — not compartmentalised agency by agency — so that a threat is identified early, understood collectively, and acted on before it matures into a major incident.</w:t>
-      </w:r>
-    </w:p>
-    <w:p>
-      <w:pPr/>
+        <w:t>Britain offers a different, equally important lesson: coordination without unnecessarily destroying existing institutions. The UK's CONTEST strategy runs on four pillars — Prevent, Pursue, Protect, and Prepare — binding together central government, intelligence agencies, police, military, emergency services, local authorities, and communities. Rather than building one gigantic police force, Britain's forty-three police forces cooperate through a national counter-terrorism structure, allowing capability to surge to wherever the threat is greatest while local community connection is preserved. The Counter Terrorism Operations Centre exists for exactly one purpose: turning shared intelligence into action faster.</w:t>
+      </w:r>
+    </w:p>
+    <w:p>
       <w:r>
         <w:rPr>
           <w:color w:val="FF0000"/>
         </w:rPr>
-        <w:t>Four principles drive this. Intelligence fusion: human sources, surveillance, signals intelligence, aerial platforms, and police reports are merged to reveal patterns no single agency would see alone. Real-time sharing: the moment a threat surfaces, whoever can act on it knows immediately — intelligence becomes a shared operational resource, not an institutional possession. Strong local intelligence: communities detect strangers and unusual movement long before any distant headquarters does, and that local reporting, once corroborated, becomes actionable intelligence. And the intelligence-to-action cycle: assess the threat, respond rapidly through the appropriate lawful mechanism, and feed every lesson learned straight back into the system.</w:t>
-      </w:r>
-    </w:p>
-    <w:p>
-      <w:pPr/>
+        <w:t>The UK's principle is simple and fits Nigeria well: centralise intelligence and standards; decentralise implementation and community engagement. We already have the beginnings of this — Nigeria's National Counter Terrorism Centre operates under the ONSA with a Whole-of-Government, Whole-of-Society mandate. Our problem is not absence of institutions. It is the degree of integration between them.</w:t>
+      </w:r>
+    </w:p>
+    <w:p>
+      <w:pPr>
+        <w:pStyle w:val="Heading2"/>
+      </w:pPr>
       <w:r>
         <w:rPr>
           <w:color w:val="FF0000"/>
         </w:rPr>
-        <w:t>For North-Central Nigeria, the application is direct. We should establish regional intelligence fusion centres linking the Armed Forces, the Police, the DSS, the NIA, the NSCDC, state security structures, forest-security personnel, and carefully managed, disciplined community intelligence networks. Drones, lawful communications analysis, and geospatial technology should support this system — never replace the human intelligence at its core.</w:t>
-      </w:r>
-    </w:p>
-    <w:p>
-      <w:pPr/>
+        <w:t>ISRAEL vs UK — A QUICK COMPARISON</w:t>
+      </w:r>
+    </w:p>
+    <w:tbl>
+      <w:tblPr>
+        <w:tblW w:type="auto" w:w="0"/>
+        <w:tblLook w:firstColumn="1" w:firstRow="1" w:lastColumn="0" w:lastRow="0" w:noHBand="0" w:noVBand="1" w:val="04A0"/>
+      </w:tblPr>
+      <w:tblGrid>
+        <w:gridCol w:w="2340"/>
+        <w:gridCol w:w="2340"/>
+        <w:gridCol w:w="2340"/>
+        <w:gridCol w:w="2340"/>
+      </w:tblGrid>
+      <w:tr>
+        <w:tc>
+          <w:tcPr>
+            <w:tcW w:type="dxa" w:w="2340"/>
+          </w:tcPr>
+          <w:p>
+            <w:r>
+              <w:rPr>
+                <w:b/>
+                <w:color w:val="FF0000"/>
+              </w:rPr>
+              <w:t>Dimension</w:t>
+            </w:r>
+          </w:p>
+        </w:tc>
+        <w:tc>
+          <w:tcPr>
+            <w:tcW w:type="dxa" w:w="2340"/>
+          </w:tcPr>
+          <w:p>
+            <w:r>
+              <w:rPr>
+                <w:b/>
+                <w:color w:val="FF0000"/>
+              </w:rPr>
+              <w:t>Israeli Model</w:t>
+            </w:r>
+          </w:p>
+        </w:tc>
+        <w:tc>
+          <w:tcPr>
+            <w:tcW w:type="dxa" w:w="2340"/>
+          </w:tcPr>
+          <w:p>
+            <w:r>
+              <w:rPr>
+                <w:b/>
+                <w:color w:val="FF0000"/>
+              </w:rPr>
+              <w:t>UK Model</w:t>
+            </w:r>
+          </w:p>
+        </w:tc>
+        <w:tc>
+          <w:tcPr>
+            <w:tcW w:type="dxa" w:w="2340"/>
+          </w:tcPr>
+          <w:p>
+            <w:r>
+              <w:rPr>
+                <w:b/>
+                <w:color w:val="FF0000"/>
+              </w:rPr>
+              <w:t>Best Lesson for Nigeria</w:t>
+            </w:r>
+          </w:p>
+        </w:tc>
+      </w:tr>
+      <w:tr>
+        <w:tc>
+          <w:tcPr>
+            <w:tcW w:type="dxa" w:w="2340"/>
+          </w:tcPr>
+          <w:p>
+            <w:r>
+              <w:rPr>
+                <w:color w:val="FF0000"/>
+              </w:rPr>
+              <w:t>Intelligence</w:t>
+            </w:r>
+          </w:p>
+        </w:tc>
+        <w:tc>
+          <w:tcPr>
+            <w:tcW w:type="dxa" w:w="2340"/>
+          </w:tcPr>
+          <w:p>
+            <w:r>
+              <w:rPr>
+                <w:color w:val="FF0000"/>
+              </w:rPr>
+              <w:t>Highly integrated</w:t>
+            </w:r>
+          </w:p>
+        </w:tc>
+        <w:tc>
+          <w:tcPr>
+            <w:tcW w:type="dxa" w:w="2340"/>
+          </w:tcPr>
+          <w:p>
+            <w:r>
+              <w:rPr>
+                <w:color w:val="FF0000"/>
+              </w:rPr>
+              <w:t>Highly coordinated</w:t>
+            </w:r>
+          </w:p>
+        </w:tc>
+        <w:tc>
+          <w:tcPr>
+            <w:tcW w:type="dxa" w:w="2340"/>
+          </w:tcPr>
+          <w:p>
+            <w:r>
+              <w:rPr>
+                <w:color w:val="FF0000"/>
+              </w:rPr>
+              <w:t>Fuse it, then act fast</w:t>
+            </w:r>
+          </w:p>
+        </w:tc>
+      </w:tr>
+      <w:tr>
+        <w:tc>
+          <w:tcPr>
+            <w:tcW w:type="dxa" w:w="2340"/>
+          </w:tcPr>
+          <w:p>
+            <w:r>
+              <w:rPr>
+                <w:color w:val="FF0000"/>
+              </w:rPr>
+              <w:t>Military role</w:t>
+            </w:r>
+          </w:p>
+        </w:tc>
+        <w:tc>
+          <w:tcPr>
+            <w:tcW w:type="dxa" w:w="2340"/>
+          </w:tcPr>
+          <w:p>
+            <w:r>
+              <w:rPr>
+                <w:color w:val="FF0000"/>
+              </w:rPr>
+              <w:t>Very prominent</w:t>
+            </w:r>
+          </w:p>
+        </w:tc>
+        <w:tc>
+          <w:tcPr>
+            <w:tcW w:type="dxa" w:w="2340"/>
+          </w:tcPr>
+          <w:p>
+            <w:r>
+              <w:rPr>
+                <w:color w:val="FF0000"/>
+              </w:rPr>
+              <w:t>More specialised</w:t>
+            </w:r>
+          </w:p>
+        </w:tc>
+        <w:tc>
+          <w:tcPr>
+            <w:tcW w:type="dxa" w:w="2340"/>
+          </w:tcPr>
+          <w:p>
+            <w:r>
+              <w:rPr>
+                <w:color w:val="FF0000"/>
+              </w:rPr>
+              <w:t>Support, never replace, HUMINT</w:t>
+            </w:r>
+          </w:p>
+        </w:tc>
+      </w:tr>
+      <w:tr>
+        <w:tc>
+          <w:tcPr>
+            <w:tcW w:type="dxa" w:w="2340"/>
+          </w:tcPr>
+          <w:p>
+            <w:r>
+              <w:rPr>
+                <w:color w:val="FF0000"/>
+              </w:rPr>
+              <w:t>Local authorities</w:t>
+            </w:r>
+          </w:p>
+        </w:tc>
+        <w:tc>
+          <w:tcPr>
+            <w:tcW w:type="dxa" w:w="2340"/>
+          </w:tcPr>
+          <w:p>
+            <w:r>
+              <w:rPr>
+                <w:color w:val="FF0000"/>
+              </w:rPr>
+              <w:t>Strong emergency role</w:t>
+            </w:r>
+          </w:p>
+        </w:tc>
+        <w:tc>
+          <w:tcPr>
+            <w:tcW w:type="dxa" w:w="2340"/>
+          </w:tcPr>
+          <w:p>
+            <w:r>
+              <w:rPr>
+                <w:color w:val="FF0000"/>
+              </w:rPr>
+              <w:t>Strong prevention role</w:t>
+            </w:r>
+          </w:p>
+        </w:tc>
+        <w:tc>
+          <w:tcPr>
+            <w:tcW w:type="dxa" w:w="2340"/>
+          </w:tcPr>
+          <w:p>
+            <w:r>
+              <w:rPr>
+                <w:color w:val="FF0000"/>
+              </w:rPr>
+              <w:t>Both — 24/7 state centres</w:t>
+            </w:r>
+          </w:p>
+        </w:tc>
+      </w:tr>
+      <w:tr>
+        <w:tc>
+          <w:tcPr>
+            <w:tcW w:type="dxa" w:w="2340"/>
+          </w:tcPr>
+          <w:p>
+            <w:r>
+              <w:rPr>
+                <w:color w:val="FF0000"/>
+              </w:rPr>
+              <w:t>Community</w:t>
+            </w:r>
+          </w:p>
+        </w:tc>
+        <w:tc>
+          <w:tcPr>
+            <w:tcW w:type="dxa" w:w="2340"/>
+          </w:tcPr>
+          <w:p>
+            <w:r>
+              <w:rPr>
+                <w:color w:val="FF0000"/>
+              </w:rPr>
+              <w:t>Active security participant</w:t>
+            </w:r>
+          </w:p>
+        </w:tc>
+        <w:tc>
+          <w:tcPr>
+            <w:tcW w:type="dxa" w:w="2340"/>
+          </w:tcPr>
+          <w:p>
+            <w:r>
+              <w:rPr>
+                <w:color w:val="FF0000"/>
+              </w:rPr>
+              <w:t>Prevention &amp; resilience partner</w:t>
+            </w:r>
+          </w:p>
+        </w:tc>
+        <w:tc>
+          <w:tcPr>
+            <w:tcW w:type="dxa" w:w="2340"/>
+          </w:tcPr>
+          <w:p>
+            <w:r>
+              <w:rPr>
+                <w:color w:val="FF0000"/>
+              </w:rPr>
+              <w:t>Citizen as sensor, not victim</w:t>
+            </w:r>
+          </w:p>
+        </w:tc>
+      </w:tr>
+      <w:tr>
+        <w:tc>
+          <w:tcPr>
+            <w:tcW w:type="dxa" w:w="2340"/>
+          </w:tcPr>
+          <w:p>
+            <w:r>
+              <w:rPr>
+                <w:color w:val="FF0000"/>
+              </w:rPr>
+              <w:t>Command</w:t>
+            </w:r>
+          </w:p>
+        </w:tc>
+        <w:tc>
+          <w:tcPr>
+            <w:tcW w:type="dxa" w:w="2340"/>
+          </w:tcPr>
+          <w:p>
+            <w:r>
+              <w:rPr>
+                <w:color w:val="FF0000"/>
+              </w:rPr>
+              <w:t>Strong operational integration</w:t>
+            </w:r>
+          </w:p>
+        </w:tc>
+        <w:tc>
+          <w:tcPr>
+            <w:tcW w:type="dxa" w:w="2340"/>
+          </w:tcPr>
+          <w:p>
+            <w:r>
+              <w:rPr>
+                <w:color w:val="FF0000"/>
+              </w:rPr>
+              <w:t>Networked coordination</w:t>
+            </w:r>
+          </w:p>
+        </w:tc>
+        <w:tc>
+          <w:tcPr>
+            <w:tcW w:type="dxa" w:w="2340"/>
+          </w:tcPr>
+          <w:p>
+            <w:r>
+              <w:rPr>
+                <w:color w:val="FF0000"/>
+              </w:rPr>
+              <w:t>One threat picture, one assessment</w:t>
+            </w:r>
+          </w:p>
+        </w:tc>
+      </w:tr>
+      <w:tr>
+        <w:tc>
+          <w:tcPr>
+            <w:tcW w:type="dxa" w:w="2340"/>
+          </w:tcPr>
+          <w:p>
+            <w:r>
+              <w:rPr>
+                <w:color w:val="FF0000"/>
+              </w:rPr>
+              <w:t>National strategy</w:t>
+            </w:r>
+          </w:p>
+        </w:tc>
+        <w:tc>
+          <w:tcPr>
+            <w:tcW w:type="dxa" w:w="2340"/>
+          </w:tcPr>
+          <w:p>
+            <w:r>
+              <w:rPr>
+                <w:color w:val="FF0000"/>
+              </w:rPr>
+              <w:t>Strong central direction</w:t>
+            </w:r>
+          </w:p>
+        </w:tc>
+        <w:tc>
+          <w:tcPr>
+            <w:tcW w:type="dxa" w:w="2340"/>
+          </w:tcPr>
+          <w:p>
+            <w:r>
+              <w:rPr>
+                <w:color w:val="FF0000"/>
+              </w:rPr>
+              <w:t>Strong central framework</w:t>
+            </w:r>
+          </w:p>
+        </w:tc>
+        <w:tc>
+          <w:tcPr>
+            <w:tcW w:type="dxa" w:w="2340"/>
+          </w:tcPr>
+          <w:p>
+            <w:r>
+              <w:rPr>
+                <w:color w:val="FF0000"/>
+              </w:rPr>
+              <w:t>Centralise intel; decentralise action</w:t>
+            </w:r>
+          </w:p>
+        </w:tc>
+      </w:tr>
+    </w:tbl>
+    <w:p>
       <w:r>
         <w:rPr>
           <w:color w:val="FF0000"/>
         </w:rPr>
-        <w:t>Britain teaches us prevention through community trust and legal safeguarding. Israel teaches us speed, fusion, and the discipline of acting on intelligence before it decays. North-Central Nigeria needs both instincts operating together: nip the threat in the bud, before it costs a single life.</w:t>
-      </w:r>
-    </w:p>
-    <w:p>
-      <w:pPr/>
-    </w:p>
-    <w:p>
-      <w:pPr>
-        <w:pStyle w:val="Heading1"/>
-        <w:spacing w:after="150" w:before="300"/>
-      </w:pPr>
-      <w:r>
-        <w:rPr>
-          <w:sz w:val="32"/>
-        </w:rPr>
-        <w:t>SECTION EIGHT: THE COMMUNITY MUST BECOME THE FIRST SENSOR</w:t>
-      </w:r>
-      <w:r>
-        <w:rPr>
-          <w:b/>
-          <w:color w:val="1F4E9C"/>
-          <w:sz w:val="32"/>
-        </w:rPr>
-        <w:t xml:space="preserve">   [SLIDE 11]</w:t>
-      </w:r>
-    </w:p>
-    <w:p>
-      <w:pPr>
-        <w:spacing w:after="200" w:line="360"/>
-        <w:jc w:val="both"/>
-      </w:pPr>
-      <w:r>
-        <w:rPr>
-          <w:sz w:val="32"/>
-          <w:szCs w:val="24"/>
-        </w:rPr>
-        <w:t xml:space="preserve">Farmers, hunters, teachers, traditional rulers, transporters, religious leaders, health workers, and market women see things no satellite and no patrol will ever see. What we need is a structured Community Early Warning and Early Response Network. Let me be precise about what this is not: it is not a vigilante system, and it is not a parallel intelligence service. It is a disciplined, legally governed community information network, accountable to the same rules of law that govern every other part of our security architecture.</w:t>
-      </w:r>
-    </w:p>
-    <w:p>
-      <w:pPr>
-        <w:spacing w:after="200" w:line="360"/>
-        <w:jc w:val="both"/>
-      </w:pPr>
-      <w:r>
-        <w:rPr>
-          <w:sz w:val="32"/>
-          <w:szCs w:val="24"/>
-        </w:rPr>
-        <w:t xml:space="preserve">Kenya's Nyumba Kumi community policing initiative and the Philippines' Barangay Peacekeeping Action Teams both demonstrate the same lesson from very different contexts: formal, well-governed community structures out-perform informal vigilantism on every measure that matters — accuracy, accountability, and sustainability.</w:t>
-      </w:r>
-    </w:p>
-    <w:p>
-      <w:pPr>
-        <w:spacing w:after="100"/>
-      </w:pPr>
-    </w:p>
-    <w:p>
-      <w:pPr>
-        <w:pStyle w:val="Heading1"/>
-        <w:spacing w:after="150" w:before="300"/>
-      </w:pPr>
-      <w:r>
-        <w:rPr>
-          <w:sz w:val="32"/>
-        </w:rPr>
-        <w:t>SECTION NINE: TRADITIONAL RULERS IN THE SECURITY ARCHITECTURE</w:t>
-      </w:r>
-      <w:r>
-        <w:rPr>
-          <w:b/>
-          <w:color w:val="1F4E9C"/>
-          <w:sz w:val="32"/>
-        </w:rPr>
-        <w:t xml:space="preserve">   [SLIDE 12]</w:t>
-      </w:r>
-    </w:p>
-    <w:p>
-      <w:pPr>
-        <w:spacing w:after="200" w:line="360"/>
-        <w:jc w:val="both"/>
-      </w:pPr>
-      <w:r>
-        <w:rPr>
-          <w:sz w:val="32"/>
-          <w:szCs w:val="24"/>
-        </w:rPr>
-        <w:t xml:space="preserve">Traditional rulers know who lives in, and who enters, their domain. They are often aware of families in conflict and land or resource disputes long before those disputes turn violent. They are frequently the first to notice radicalisation among youth, and they know the criminal routes and rising tensions within their own communities better than any outsider ever will. Yet today they are consulted mostly after violence occurs, when their value would be greatest before it. The structured interface I propose links the Traditional Council directly with Police, DSS, a Military Liaison officer, Local Government, and Community Representatives — a standing table, not an emergency meeting.</w:t>
-      </w:r>
-    </w:p>
-    <w:p>
-      <w:pPr>
-        <w:spacing w:after="100"/>
-      </w:pPr>
-    </w:p>
-    <w:p>
-      <w:pPr>
-        <w:pStyle w:val="Heading1"/>
-        <w:spacing w:after="150" w:before="300"/>
-      </w:pPr>
-      <w:r>
-        <w:rPr>
-          <w:sz w:val="32"/>
-        </w:rPr>
-        <w:t>SECTION TEN: SECURITY CORRIDORS, NOT ADMINISTRATIVE BOUNDARIES</w:t>
-      </w:r>
-      <w:r>
-        <w:rPr>
-          <w:b/>
-          <w:color w:val="1F4E9C"/>
-          <w:sz w:val="32"/>
-        </w:rPr>
-        <w:t xml:space="preserve">   [SLIDE 13]</w:t>
-      </w:r>
-    </w:p>
-    <w:p>
-      <w:pPr>
-        <w:spacing w:after="200" w:line="360"/>
-        <w:jc w:val="both"/>
-      </w:pPr>
-      <w:r>
-        <w:rPr>
-          <w:sz w:val="32"/>
-          <w:szCs w:val="24"/>
-        </w:rPr>
-        <w:t xml:space="preserve">A criminal group does not stop at a state border. Neither should our response. Kwara–Niger–Kainji, Niger–Kaduna–FCT, Benue–Nasarawa, Benue–Taraba, Plateau–Bauchi, and Kogi–Nasarawa–Benue are not abstractions on a map; they are the actual corridors along which threats move today. North-Central governors agreed in 2025 to pursue joint security operations across these very corridors. The next step is not another agreement. It is institutionalisation — giving that political agreement a permanent operational home.</w:t>
-      </w:r>
-    </w:p>
-    <w:p>
-      <w:pPr>
-        <w:spacing w:after="100"/>
-      </w:pPr>
-    </w:p>
+        <w:t>Neither model alone is right for us. The right answer is a hybrid: Israeli intelligence integration, Israeli local resilience, British institutional coordination, and Nigerian community intelligence. I call it the North-Central Integrated Security and Resilience Model — NCISRM. It does not require new bureaucracy. It requires connecting what already exists: the NCTC's all-source intelligence function, our security agencies, our traditional institutions, and our communities, into one coherent architecture.</w:t>
+      </w:r>
+    </w:p>
+    <w:p/>
+    <w:p>
+      <w:pPr>
+        <w:pStyle w:val="Heading1"/>
+      </w:pPr>
+      <w:r>
+        <w:rPr>
+          <w:color w:val="FF0000"/>
+        </w:rPr>
+        <w:t>SECTION EIGHT: THE NCISRM — FIVE LEVELS, ONE SYSTEM   [SLIDE 11]</w:t>
+      </w:r>
+    </w:p>
+    <w:p>
+      <w:r>
+        <w:rPr>
+          <w:color w:val="FF0000"/>
+        </w:rPr>
+        <w:t>I propose five levels. Level One: a Regional Security Fusion Centre, linked to ONSA and the NCTC, fusing DSS, defence, NAF and Army intelligence, Police intelligence, NSCDC, Immigration, Customs, state security information, forest-ranger reporting, local government information, community intelligence, and technological surveillance — into one threat picture, one regional assessment.</w:t>
+      </w:r>
+    </w:p>
+    <w:p>
+      <w:r>
+        <w:rPr>
+          <w:color w:val="FF0000"/>
+        </w:rPr>
+        <w:t>Level Two: State Security Coordination Centres in every state, providing twenty-four-hour situational awareness, not just meeting after an attack. The Governor remains constitutionally responsible for state-level coordination; federal agencies retain their statutory roles.</w:t>
+      </w:r>
+    </w:p>
+    <w:p>
+      <w:r>
+        <w:rPr>
+          <w:color w:val="FF0000"/>
+        </w:rPr>
+        <w:t>Level Three: a Local Security Network in every high-risk local government, connecting security agencies, traditional institutions, local government, community leaders, farmers, pastoralists, credible civil society, and trained community observers. This is not vigilante justice — it is structured early warning and lawful information sharing.</w:t>
+      </w:r>
+    </w:p>
+    <w:p>
+      <w:r>
+        <w:rPr>
+          <w:color w:val="FF0000"/>
+        </w:rPr>
+        <w:t>Level Four: the forest and rural security layer. Our forests cannot remain intelligence black holes. Nigeria's emerging forest-security initiative should connect directly into this regional architecture, with personnel serving as the eyes and ears of the state in difficult terrain, while specialised military and police units handle high-risk operations.</w:t>
+      </w:r>
+    </w:p>
+    <w:p>
+      <w:r>
+        <w:rPr>
+          <w:color w:val="FF0000"/>
+        </w:rPr>
+        <w:t>Level Five: the citizen. Every community should know who to call, what to report, how to report it, and what happens after they report it. The citizen must become a sensor in the security network — not simply a casualty statistic.</w:t>
+      </w:r>
+    </w:p>
+    <w:p/>
+    <w:p>
+      <w:pPr>
+        <w:pStyle w:val="Heading1"/>
+      </w:pPr>
+      <w:r>
+        <w:rPr>
+          <w:color w:val="FF0000"/>
+        </w:rPr>
+        <w:t>SECTION NINE: THE ROLE OF VETERANS — THE NORTH-CENTRAL ADVANTAGE   [SLIDE 12]</w:t>
+      </w:r>
+    </w:p>
+    <w:p>
+      <w:r>
+        <w:rPr>
+          <w:color w:val="FF0000"/>
+        </w:rPr>
+        <w:t>Nigeria holds an advantage Israel and Britain do not have in quite the same form: a large pool of experienced retired military, intelligence, police, and security professionals. This resource should be deliberately built into the architecture — contributing intelligence analysis, strategic planning, training and mentoring, emergency preparedness, community-security programmes, simulation exercises, early-warning systems, leadership development, and evaluation of lessons learned. They should not replace serving personnel. They should constitute a Regional Security Advisory and Training Reserve — a reservoir of experience strengthening the system without creating a parallel armed force.</w:t>
+      </w:r>
+    </w:p>
+    <w:p/>
+    <w:p>
+      <w:pPr>
+        <w:pStyle w:val="Heading1"/>
+      </w:pPr>
+      <w:r>
+        <w:rPr>
+          <w:color w:val="FF0000"/>
+        </w:rPr>
+        <w:t>SECTION TEN: FROM REACTION TO PREVENTION — THE FIFTH P   [SLIDE 13]</w:t>
+      </w:r>
+    </w:p>
+    <w:p>
+      <w:r>
+        <w:rPr>
+          <w:color w:val="FF0000"/>
+        </w:rPr>
+        <w:t>The habit we must break is: attack, deploy troops, fight, withdraw, wait for the next attack. That is reactive security. Israel and Britain teach us to move toward: information, analysis, early warning, prevention, disruption, response, recovery, learning. That is collaborative security. Britain calls this Prevent, Pursue, Protect, and Prepare. For North-Central Nigeria, I add a fifth: Partner. Prevent. Pursue. Protect. Prepare. Partner.</w:t>
+      </w:r>
+    </w:p>
+    <w:p>
+      <w:r>
+        <w:rPr>
+          <w:color w:val="FF0000"/>
+        </w:rPr>
+        <w:t>The fundamental lesson from Israel is that no intelligence should remain isolated, and no community should remain disconnected from the security system. The fundamental lesson from Britain is that different agencies can retain their identities while operating toward one national objective. The Nigerian lesson is that our solution must be built around our own geography, our communities, our constitutional structure, and our own realities. I recommend that the North-Central region adopt this hybrid Israeli-British collaborative security architecture, but make it unmistakably Nigerian.</w:t>
+      </w:r>
+    </w:p>
+    <w:p/>
     <w:p>
       <w:pPr>
         <w:pStyle w:val="Heading1"/>

</xml_diff>

<commit_message>
Rebuild deck: new 6-section Introduction replaces old Opening+Sections 1-6; full renumber to 28 slides
</commit_message>
<xml_diff>
--- a/avm_morgan_docs/AVM_MORGAN_SECURITY_KEYNOTE_ADDRESS_V4_MOD_AUG31.docx
+++ b/avm_morgan_docs/AVM_MORGAN_SECURITY_KEYNOTE_ADDRESS_V4_MOD_AUG31.docx
@@ -93,7 +93,7 @@
           <w:sz w:val="32"/>
           <w:szCs w:val="22"/>
         </w:rPr>
-        <w:t>Honourable Minister of Defence, Service Chiefs, distinguished officials of the Ministry, ladies and gentlemen,</w:t>
+        <w:t>Distinguished military and security experts, policymakers, traditional leaders, ladies and gentlemen,</w:t>
       </w:r>
     </w:p>
     <w:p>
@@ -107,353 +107,148 @@
     <w:p>
       <w:pPr>
         <w:pStyle w:val="Heading1"/>
-        <w:spacing w:after="150" w:before="300"/>
-      </w:pPr>
-      <w:r>
-        <w:rPr>
-          <w:sz w:val="32"/>
-        </w:rPr>
-        <w:t xml:space="preserve">OPENING: ONE ECOSYSTEM, NOT SEPARATE PROBLEMS</w:t>
-      </w:r>
-      <w:r>
-        <w:rPr>
-          <w:b/>
-          <w:color w:val="1F4E9C"/>
-          <w:sz w:val="32"/>
-        </w:rPr>
-        <w:t xml:space="preserve">   [SLIDES 2–3]</w:t>
-      </w:r>
-    </w:p>
-    <w:p>
-      <w:pPr>
-        <w:spacing w:after="200" w:line="360"/>
-        <w:jc w:val="both"/>
-      </w:pPr>
-      <w:r>
-        <w:rPr>
-          <w:sz w:val="32"/>
-        </w:rPr>
-        <w:t>Nigeria's security architecture today sits at a genuine inflection point. Insurgency in the North-East has evolved and, in places, converged with banditry corridors further west and south. Farmer-herder conflict across the Middle Belt has intensified rather than eased over the past three years, and here in North-Central Nigeria we feel that intensification most directly.</w:t>
-      </w:r>
-    </w:p>
-    <w:p>
-      <w:pPr>
-        <w:spacing w:after="200" w:line="360"/>
-        <w:jc w:val="both"/>
-      </w:pPr>
-      <w:r>
-        <w:rPr>
-          <w:sz w:val="32"/>
-        </w:rPr>
-        <w:t>In December 2023, over one hundred and forty people were killed across more than seventeen rural communities in Plateau State in a single coordinated wave of Christmas Eve attacks. Barely a month later, in January 2024, at least thirty more people were killed in further attacks around Mangu town. This was not a one-off spike. Between May 2023 and May 2025, one thousand and forty-three people were killed in Benue State alone. And the single deadliest recent incident came on the night of the thirteenth and fourteenth of June 2025, when the Yelwata massacre in Guma Local Government Area of Benue State killed at least one hundred and fifty to one hundred and sixty people in one night — an incident so severe that Nigeria formally charged nine men with terrorism over it in February of this year, and one that moved even Pope Leo to publicly pray for the victims at his Sunday Angelus.</w:t>
-      </w:r>
-    </w:p>
-    <w:p>
-      <w:pPr>
-        <w:spacing w:after="200" w:line="360"/>
-        <w:jc w:val="both"/>
-      </w:pPr>
-      <w:r>
-        <w:rPr>
-          <w:sz w:val="32"/>
-        </w:rPr>
-        <w:t>The human cost compounds directly into displacement. As of the thirty-first of December 2024, five hundred thousand, one hundred and eighty-two people were already living in displacement camps in Benue State alone. By October 2025, North-Central and North-West Nigeria combined were hosting one million, three hundred and seventy-eight thousand, one hundred and twenty-four internally displaced persons. These are not abstract statistics. They are mothers, farmers, and traditional rulers — the very people I want this address to speak for.</w:t>
-      </w:r>
-    </w:p>
-    <w:p>
-      <w:pPr>
-        <w:spacing w:after="200" w:line="360"/>
-        <w:jc w:val="both"/>
-      </w:pPr>
-      <w:r>
-        <w:rPr>
-          <w:sz w:val="32"/>
-          <w:szCs w:val="24"/>
-        </w:rPr>
-        <w:t xml:space="preserve">My central argument today is simple to state and difficult to achieve: North-Central Nigeria cannot defeat insecurity through military operations alone. History has tried to teach us this lesson repeatedly, in Nigeria and elsewhere, and we would do well to finally learn it. What this region requires is a permanent partnership between the military, the police, the intelligence services, state and local governments, traditional institutions, communities, technology providers, and citizens themselves. Not a temporary task force. Not another committee. A permanent architecture.</w:t>
-      </w:r>
-    </w:p>
-    <w:p>
-      <w:pPr>
-        <w:spacing w:after="100"/>
-      </w:pPr>
-    </w:p>
-    <w:p>
-      <w:pPr>
-        <w:pStyle w:val="Heading1"/>
-        <w:spacing w:after="150" w:before="300"/>
-      </w:pPr>
-      <w:r>
-        <w:rPr>
-          <w:sz w:val="32"/>
-        </w:rPr>
-        <w:t xml:space="preserve">SECTION ONE: THE NORTH-CENTRAL SECURITY QUESTION</w:t>
-      </w:r>
-      <w:r>
-        <w:rPr>
-          <w:b/>
-          <w:color w:val="1F4E9C"/>
-          <w:sz w:val="32"/>
-        </w:rPr>
-        <w:t xml:space="preserve">   [SLIDE 4]</w:t>
-      </w:r>
-    </w:p>
-    <w:p>
-      <w:pPr>
-        <w:spacing w:after="200" w:line="360"/>
-        <w:jc w:val="both"/>
-      </w:pPr>
-      <w:r>
-        <w:rPr>
-          <w:sz w:val="32"/>
-          <w:szCs w:val="24"/>
-        </w:rPr>
-        <w:t xml:space="preserve">Benue, Kogi, Kwara, Nasarawa, Niger, Plateau, and the Federal Capital Territory form the bridge between the north and south of this country. They contain our major agricultural belts, our forests, our highways, our energy infrastructure. And increasingly, they contain terrorism and infiltration, banditry, kidnapping for ransom, farmer-herder conflict, communal violence, arms trafficking, illegal mining, rural criminality, and the steady recruitment of our youth into criminal networks.</w:t>
-      </w:r>
-    </w:p>
-    <w:p>
-      <w:pPr>
-        <w:spacing w:after="200" w:line="360"/>
-        <w:jc w:val="both"/>
-      </w:pPr>
-      <w:r>
-        <w:rPr>
-          <w:sz w:val="32"/>
-          <w:szCs w:val="24"/>
-        </w:rPr>
-        <w:t xml:space="preserve">The Armed Conflict Location and Event Data Project, ACLED, has recorded hundreds of security incidents and substantial fatalities across Benue, Plateau and Niger between January 2024 and December 2025. Niger State and parts of Kwara face terrorist activity and the cross-border movement of armed groups. The evidence is not ambiguous. The enemy does not respect state boundaries. Why, then, should our response?</w:t>
-      </w:r>
-    </w:p>
-    <w:p>
-      <w:pPr>
-        <w:spacing w:after="100"/>
-      </w:pPr>
-    </w:p>
-    <w:p>
-      <w:pPr>
-        <w:pStyle w:val="Heading1"/>
-        <w:spacing w:after="150" w:before="300"/>
-      </w:pPr>
-      <w:r>
-        <w:rPr>
-          <w:sz w:val="32"/>
-        </w:rPr>
-        <w:t xml:space="preserve">SECTION TWO: THE CENTRAL PROBLEM — WE ARE TOO REACTIVE</w:t>
-      </w:r>
-      <w:r>
-        <w:rPr>
-          <w:b/>
-          <w:color w:val="1F4E9C"/>
-          <w:sz w:val="32"/>
-        </w:rPr>
-        <w:t xml:space="preserve">   [SLIDE 5]</w:t>
-      </w:r>
-    </w:p>
-    <w:p>
-      <w:pPr>
-        <w:spacing w:after="200" w:line="360"/>
-        <w:jc w:val="both"/>
-      </w:pPr>
-      <w:r>
-        <w:rPr>
-          <w:sz w:val="32"/>
-          <w:szCs w:val="24"/>
-        </w:rPr>
-        <w:t xml:space="preserve">Look honestly at the cycle we have normalised. An attack occurs. People are killed. Police are alerted. The military is mobilised. The attackers vanish. The community is searched. We wait. This is a cycle of reaction without prevention, and no amount of additional manpower fixes a cycle that is structurally reactive.</w:t>
-      </w:r>
-    </w:p>
-    <w:p>
-      <w:pPr>
-        <w:spacing w:after="200" w:line="360"/>
-        <w:jc w:val="both"/>
-      </w:pPr>
-      <w:r>
-        <w:rPr>
-          <w:sz w:val="32"/>
-          <w:szCs w:val="24"/>
-        </w:rPr>
-        <w:t xml:space="preserve">We saw a version of this same trap in Colombia through the 1990s, where purely kinetic operations against armed groups produced tactical wins without strategic progress, until the state paired military pressure with local intelligence networks and community reintegration — the approach that eventually underpinned Plan Colombia's later, more durable gains. We must make the same shift here, and we must make it deliberately. The question we ask ourselves must change. Not "an attack has occurred, what do we do?" but "what is the probability of an attack, and what can we do today to prevent it?"</w:t>
-      </w:r>
-    </w:p>
-    <w:p>
-      <w:pPr>
-        <w:spacing w:after="100"/>
-      </w:pPr>
-    </w:p>
-    <w:p>
-      <w:pPr>
-        <w:pStyle w:val="Heading1"/>
-        <w:spacing w:after="150" w:before="300"/>
-      </w:pPr>
-      <w:r>
-        <w:rPr>
-          <w:sz w:val="32"/>
-        </w:rPr>
-        <w:t xml:space="preserve">SECTION THREE: SECURITY AS COLLECTIVE RESPONSIBILITY</w:t>
-      </w:r>
-      <w:r>
-        <w:rPr>
-          <w:b/>
-          <w:color w:val="1F4E9C"/>
-          <w:sz w:val="32"/>
-        </w:rPr>
-        <w:t xml:space="preserve">   [SLIDE 6]</w:t>
-      </w:r>
-    </w:p>
-    <w:p>
-      <w:pPr>
-        <w:spacing w:after="200" w:line="360"/>
-        <w:jc w:val="both"/>
-      </w:pPr>
-      <w:r>
-        <w:rPr>
-          <w:sz w:val="32"/>
-          <w:szCs w:val="24"/>
-        </w:rPr>
-        <w:t xml:space="preserve">No single agency can do everything. But together, our agencies can know almost everything that matters. This requires five disciplines operating as one cycle: we must SEE, by collecting information; we must SHARE, by moving it fast to those who need it; we must DECIDE, by establishing clear responsibility and command; we must ACT, by responding proportionately and rapidly; and we must LEARN, by analysing what happened and preventing its repetition.</w:t>
-      </w:r>
-    </w:p>
-    <w:p>
-      <w:pPr>
-        <w:spacing w:after="100"/>
-      </w:pPr>
-    </w:p>
-    <w:p>
-      <w:pPr>
-        <w:pStyle w:val="Heading1"/>
-        <w:spacing w:after="150" w:before="300"/>
-      </w:pPr>
-      <w:r>
-        <w:rPr>
-          <w:sz w:val="32"/>
-        </w:rPr>
-        <w:t xml:space="preserve">SECTION FOUR: ONE SECURITY PICTURE, MULTIPLE CAPABILITIES</w:t>
-      </w:r>
-      <w:r>
-        <w:rPr>
-          <w:b/>
-          <w:color w:val="1F4E9C"/>
-          <w:sz w:val="32"/>
-        </w:rPr>
-        <w:t xml:space="preserve">   [SLIDE 7]</w:t>
-      </w:r>
-    </w:p>
-    <w:p>
-      <w:pPr>
-        <w:spacing w:after="200" w:line="360"/>
-        <w:jc w:val="both"/>
-      </w:pPr>
-      <w:r>
-        <w:rPr>
-          <w:sz w:val="32"/>
-          <w:szCs w:val="24"/>
-        </w:rPr>
-        <w:t xml:space="preserve">The Armed Forces, the Police Force, the DSS, the NSCDC, the NDLEA and Customs, State Security Councils, Local Government structures, Traditional Institutions, and Community and Civil Society organisations each hold a piece of the picture. None of them, alone, holds the whole picture. The intelligence value — the real operational value — is created only when these pieces are fused into one threat picture. This is not a philosophical point. It is the single most practical reform available to us, and it costs far less than another battalion.</w:t>
-      </w:r>
-    </w:p>
-    <w:p>
-      <w:pPr>
-        <w:spacing w:after="100"/>
-      </w:pPr>
-    </w:p>
-    <w:p>
-      <w:pPr>
-        <w:pStyle w:val="Heading1"/>
-        <w:spacing w:after="150" w:before="300"/>
-      </w:pPr>
-      <w:r>
-        <w:rPr>
-          <w:sz w:val="32"/>
-        </w:rPr>
-        <w:t xml:space="preserve">SECTION FIVE: A REGIONAL SECURITY INTELLIGENCE AND FUSION CENTRE</w:t>
-      </w:r>
-      <w:r>
-        <w:rPr>
-          <w:b/>
-          <w:color w:val="1F4E9C"/>
-          <w:sz w:val="32"/>
-        </w:rPr>
-        <w:t xml:space="preserve">   [SLIDE 8]</w:t>
-      </w:r>
-    </w:p>
-    <w:p>
-      <w:pPr>
-        <w:spacing w:after="200" w:line="360"/>
-        <w:jc w:val="both"/>
-      </w:pPr>
-      <w:r>
-        <w:rPr>
-          <w:sz w:val="32"/>
-          <w:szCs w:val="24"/>
-        </w:rPr>
-        <w:t xml:space="preserve">A fusion centre exists to answer five questions continuously: where is the threat, who is responsible, what is their capability, what are they likely to do next, and what resource can respond fastest. It maintains a living operational picture — attack locations and kidnapping incidents, suspicious movements and criminal corridors, conflict flashpoints and abandoned settlements, vulnerable highways and forests, illegal mining and arms trafficking routes, and displacement concentrations.</w:t>
-      </w:r>
-    </w:p>
-    <w:p>
-      <w:pPr>
-        <w:spacing w:after="200" w:line="360"/>
-        <w:jc w:val="both"/>
-      </w:pPr>
-      <w:r>
-        <w:rPr>
-          <w:sz w:val="32"/>
-          <w:szCs w:val="24"/>
-        </w:rPr>
-        <w:t xml:space="preserve">This is not a new invention. The United Kingdom's Joint Terrorism Analysis Centre and the United States' National Counterterrorism Center were both built on the same premise — that fragmented agencies, however capable individually, lose to threats that move faster than their information does. India's Multi-Agency Centre model, built after the 2008 Mumbai attacks exposed exactly this kind of fragmentation, shows what happens when a state finally decides fusion is not optional. North-Central Nigeria needs its own version, built for our terrain and our institutions, but built on the same principle.</w:t>
-      </w:r>
-    </w:p>
-    <w:p>
-      <w:pPr>
-        <w:spacing w:after="100"/>
-      </w:pPr>
-    </w:p>
-    <w:p>
-      <w:pPr>
-        <w:pStyle w:val="Heading1"/>
-        <w:spacing w:after="150" w:before="300"/>
-      </w:pPr>
-      <w:r>
-        <w:rPr>
-          <w:sz w:val="32"/>
-        </w:rPr>
-        <w:t xml:space="preserve">SECTION SIX: FROM INTELLIGENCE COLLECTION TO INTELLIGENCE ACTION</w:t>
-      </w:r>
-      <w:r>
-        <w:rPr>
-          <w:b/>
-          <w:color w:val="1F4E9C"/>
-          <w:sz w:val="32"/>
-        </w:rPr>
-        <w:t xml:space="preserve">   [SLIDE 9]</w:t>
-      </w:r>
-    </w:p>
-    <w:p>
-      <w:pPr>
-        <w:spacing w:after="200" w:line="360"/>
-        <w:jc w:val="both"/>
-      </w:pPr>
-      <w:r>
-        <w:rPr>
-          <w:sz w:val="32"/>
-          <w:szCs w:val="24"/>
-        </w:rPr>
-        <w:t xml:space="preserve">Ask yourself honestly: how long does it currently take for a credible warning from a village to become an operational decision? The pathway must run cleanly from the community, to a local intelligence node, to the fusion centre, to threat assessment, to the security agency, to rapid response, and back again with confirmation and follow-up. That last step — the follow-up — is the one we neglect most, and it is the one that determines whether the whole system survives contact with reality. The community must receive feedback. If people repeatedly provide information and nothing happens, they stop reporting. If they see that lives are saved because of what they told us, trust grows, and the network strengthens itself.</w:t>
-      </w:r>
-    </w:p>
-    <w:p>
-      <w:pPr>
-        <w:spacing w:after="100"/>
-      </w:pPr>
-    </w:p>
-    <w:p>
-      <w:pPr>
-        <w:pStyle w:val="Heading1"/>
-      </w:pPr>
-      <w:r>
-        <w:rPr>
-          <w:color w:val="FF0000"/>
-        </w:rPr>
-        <w:t>SECTION SEVEN: THE ISRAELI MODEL AND THE BRITISH MODEL — TWO LESSONS IN INTEGRATION   [SLIDE 10]</w:t>
+      </w:pPr>
+      <w:r>
+        <w:rPr>
+          <w:color w:val="FF0000"/>
+        </w:rPr>
+        <w:t>SECTION ONE: THE NORTH-CENTRAL PARADOX   [SLIDE 2]</w:t>
+      </w:r>
+    </w:p>
+    <w:p>
+      <w:r>
+        <w:rPr>
+          <w:color w:val="FF0000"/>
+        </w:rPr>
+        <w:t>The North-Central region occupies a unique position in the Nigerian federation. Geographically, it is the bridge between the North and the South; strategically, it is the heartland of Nigeria's territorial cohesion; economically, it contains some of the country's most important agricultural lands, forests, water resources and mineral deposits. Yet, paradoxically, this region that should be a bastion of national unity and food security has increasingly become an arena of insecurity, displacement, communal tension, kidnapping, banditry and violent competition over land and resources.</w:t>
+      </w:r>
+    </w:p>
+    <w:p/>
+    <w:p>
+      <w:pPr>
+        <w:pStyle w:val="Heading1"/>
+      </w:pPr>
+      <w:r>
+        <w:rPr>
+          <w:color w:val="FF0000"/>
+        </w:rPr>
+        <w:t>SECTION TWO: THE CRITICAL QUESTION — FRAGMENTATION, NOT ABSENCE   [SLIDE 3]</w:t>
+      </w:r>
+    </w:p>
+    <w:p>
+      <w:r>
+        <w:rPr>
+          <w:color w:val="FF0000"/>
+        </w:rPr>
+        <w:t>The critical question before us, therefore, is not simply who is responsible for the insecurity. It is more fundamental: why, despite the presence of the Armed Forces, Police, intelligence agencies, civil defence, state institutions and traditional community structures, does insecurity continue to reproduce itself? My submission is that the challenge is not principally the absence of security institutions. It is the fragmentation of the security response.</w:t>
+      </w:r>
+    </w:p>
+    <w:p>
+      <w:r>
+        <w:rPr>
+          <w:color w:val="FF0000"/>
+        </w:rPr>
+        <w:t>Today, a threat may be seen first by a farmer, a traditional ruler, a local vigilante, a forest ranger, a police officer or an intelligence operative. But if that information does not rapidly enter a common intelligence system, reach the appropriate command structure, and translate into timely action, intelligence becomes merely information — and information that does not produce action cannot protect lives.</w:t>
+      </w:r>
+    </w:p>
+    <w:p/>
+    <w:p>
+      <w:pPr>
+        <w:pStyle w:val="Heading1"/>
+      </w:pPr>
+      <w:r>
+        <w:rPr>
+          <w:color w:val="FF0000"/>
+        </w:rPr>
+        <w:t>SECTION THREE: COLLABORATION AS THE CENTREPIECE   [SLIDE 4]</w:t>
+      </w:r>
+    </w:p>
+    <w:p>
+      <w:r>
+        <w:rPr>
+          <w:color w:val="FF0000"/>
+        </w:rPr>
+        <w:t>This is why collaboration must become the centrepiece of the North-Central security architecture. By collaboration, I do not mean merely bringing security agencies together for occasional meetings. I mean creating a system in which intelligence is shared, capabilities are integrated, responsibilities are complementary, communities are engaged, technology is exploited, and every level of government understands its role in one common security framework. Nigeria has already embraced this philosophy at the national level: the National Counter Terrorism Centre operates on a Whole-of-Government and Whole-of-Society principle, recognising that terrorism and violent extremism cannot be defeated by one institution acting alone.</w:t>
+      </w:r>
+    </w:p>
+    <w:p/>
+    <w:p>
+      <w:pPr>
+        <w:pStyle w:val="Heading1"/>
+      </w:pPr>
+      <w:r>
+        <w:rPr>
+          <w:color w:val="FF0000"/>
+        </w:rPr>
+        <w:t>SECTION FOUR: FOUR SHIFTS THE NORTH-CENTRAL MUST MAKE   [SLIDE 5]</w:t>
+      </w:r>
+    </w:p>
+    <w:p>
+      <w:r>
+        <w:rPr>
+          <w:color w:val="FF0000"/>
+        </w:rPr>
+        <w:t>The North-Central requires us to take this principle further. We must move from agency-centric security to system-centric security; from reaction to prevention; from isolated intelligence to intelligence fusion; and from government-only security to government-community partnership.</w:t>
+      </w:r>
+    </w:p>
+    <w:p/>
+    <w:p>
+      <w:pPr>
+        <w:pStyle w:val="Heading1"/>
+      </w:pPr>
+      <w:r>
+        <w:rPr>
+          <w:color w:val="FF0000"/>
+        </w:rPr>
+        <w:t>SECTION FIVE: LESSONS FROM ISRAEL AND BRITAIN — TOWARD A NIGERIAN MODEL   [SLIDE 6]</w:t>
+      </w:r>
+    </w:p>
+    <w:p>
+      <w:r>
+        <w:rPr>
+          <w:color w:val="FF0000"/>
+        </w:rPr>
+        <w:t>There are useful lessons before us. Israel demonstrates the power of integrating intelligence, military capabilities, emergency structures and communities into a resilient security system. Britain demonstrates how different institutions can retain their distinct responsibilities while operating within a coordinated national framework. But Nigeria cannot simply copy either model. We must develop a Nigerian model — one that combines intelligence fusion, inter-agency coordination, state and local government participation, traditional institutions, community early-warning systems, modern technology and the enormous reservoir of experience resident in our retired military, intelligence, police and security professionals.</w:t>
+      </w:r>
+    </w:p>
+    <w:p/>
+    <w:p>
+      <w:pPr>
+        <w:pStyle w:val="Heading1"/>
+      </w:pPr>
+      <w:r>
+        <w:rPr>
+          <w:color w:val="FF0000"/>
+        </w:rPr>
+        <w:t>SECTION SIX: COLLABORATIVE SECURITY — THE PROPOSITION   [SLIDE 7]</w:t>
+      </w:r>
+    </w:p>
+    <w:p>
+      <w:r>
+        <w:rPr>
+          <w:color w:val="FF0000"/>
+        </w:rPr>
+        <w:t>The objective is not to militarise society. It is to make society security-conscious, security-connected and resilient, while ensuring that the professional security forces retain responsibility for lawful enforcement and kinetic operations.</w:t>
+      </w:r>
+    </w:p>
+    <w:p>
+      <w:r>
+        <w:rPr>
+          <w:color w:val="FF0000"/>
+        </w:rPr>
+        <w:t>The proposition of this paper, therefore, is simple: the security of the North-Central cannot be achieved by the military alone, the police alone, government alone, or communities alone. It can only be achieved when all these elements become parts of one coherent security ecosystem. That is the essence of collaborative security. And if properly designed and implemented, collaboration is not merely another strategy for the North-Central — it may well be the panacea, the missing architecture, for transforming the region from a theatre of recurring insecurity into a zone of enduring peace, stability, agricultural productivity and national cohesion.</w:t>
+      </w:r>
+    </w:p>
+    <w:p/>
+    <w:p>
+      <w:pPr>
+        <w:pStyle w:val="Heading1"/>
+      </w:pPr>
+      <w:r>
+        <w:rPr>
+          <w:color w:val="FF0000"/>
+        </w:rPr>
+        <w:t>SECTION SEVEN: THE ISRAELI MODEL AND THE BRITISH MODEL — TWO LESSONS IN INTEGRATION   [SLIDE 8]</w:t>
       </w:r>
     </w:p>
     <w:p>
@@ -910,7 +705,7 @@
         <w:rPr>
           <w:color w:val="FF0000"/>
         </w:rPr>
-        <w:t>SECTION EIGHT: THE NCISRM — FIVE LEVELS, ONE SYSTEM   [SLIDE 11]</w:t>
+        <w:t>SECTION EIGHT: THE NCISRM — FIVE LEVELS, ONE SYSTEM   [SLIDE 9]</w:t>
       </w:r>
     </w:p>
     <w:p>
@@ -962,7 +757,7 @@
         <w:rPr>
           <w:color w:val="FF0000"/>
         </w:rPr>
-        <w:t>SECTION NINE: THE ROLE OF VETERANS — THE NORTH-CENTRAL ADVANTAGE   [SLIDE 12]</w:t>
+        <w:t>SECTION NINE: THE ROLE OF VETERANS — THE NORTH-CENTRAL ADVANTAGE   [SLIDE 10]</w:t>
       </w:r>
     </w:p>
     <w:p>
@@ -982,7 +777,7 @@
         <w:rPr>
           <w:color w:val="FF0000"/>
         </w:rPr>
-        <w:t>SECTION TEN: FROM REACTION TO PREVENTION — THE FIFTH P   [SLIDE 13]</w:t>
+        <w:t>SECTION TEN: FROM REACTION TO PREVENTION — THE FIFTH P   [SLIDE 11]</w:t>
       </w:r>
     </w:p>
     <w:p>
@@ -1019,7 +814,7 @@
           <w:color w:val="1F4E9C"/>
           <w:sz w:val="32"/>
         </w:rPr>
-        <w:t xml:space="preserve">   [SLIDE 14]</w:t>
+        <w:t xml:space="preserve">   [SLIDE 12]</w:t>
       </w:r>
     </w:p>
     <w:p>
@@ -1057,7 +852,7 @@
           <w:color w:val="1F4E9C"/>
           <w:sz w:val="32"/>
         </w:rPr>
-        <w:t xml:space="preserve">   [SLIDE 15]</w:t>
+        <w:t xml:space="preserve">   [SLIDE 13]</w:t>
       </w:r>
     </w:p>
     <w:p>
@@ -1095,7 +890,7 @@
           <w:color w:val="1F4E9C"/>
           <w:sz w:val="32"/>
         </w:rPr>
-        <w:t xml:space="preserve">   [SLIDE 16]</w:t>
+        <w:t xml:space="preserve">   [SLIDE 14]</w:t>
       </w:r>
     </w:p>
     <w:p>
@@ -1133,7 +928,7 @@
           <w:color w:val="1F4E9C"/>
           <w:sz w:val="32"/>
         </w:rPr>
-        <w:t xml:space="preserve">   [SLIDE 17]</w:t>
+        <w:t xml:space="preserve">   [SLIDE 15]</w:t>
       </w:r>
     </w:p>
     <w:p>
@@ -1171,7 +966,7 @@
           <w:color w:val="1F4E9C"/>
           <w:sz w:val="32"/>
         </w:rPr>
-        <w:t xml:space="preserve">   [SLIDE 18]</w:t>
+        <w:t xml:space="preserve">   [SLIDE 16]</w:t>
       </w:r>
     </w:p>
     <w:p>
@@ -1209,7 +1004,7 @@
           <w:color w:val="1F4E9C"/>
           <w:sz w:val="32"/>
         </w:rPr>
-        <w:t xml:space="preserve">   [SLIDE 19]</w:t>
+        <w:t xml:space="preserve">   [SLIDE 17]</w:t>
       </w:r>
     </w:p>
     <w:p>
@@ -1247,7 +1042,7 @@
           <w:color w:val="1F4E9C"/>
           <w:sz w:val="32"/>
         </w:rPr>
-        <w:t xml:space="preserve">   [SLIDE 20]</w:t>
+        <w:t xml:space="preserve">   [SLIDE 18]</w:t>
       </w:r>
     </w:p>
     <w:p>
@@ -1285,7 +1080,7 @@
           <w:color w:val="1F4E9C"/>
           <w:sz w:val="32"/>
         </w:rPr>
-        <w:t xml:space="preserve">   [SLIDE 21]</w:t>
+        <w:t xml:space="preserve">   [SLIDE 19]</w:t>
       </w:r>
     </w:p>
     <w:p>
@@ -1323,7 +1118,7 @@
           <w:color w:val="1F4E9C"/>
           <w:sz w:val="32"/>
         </w:rPr>
-        <w:t xml:space="preserve">   [SLIDE 22]</w:t>
+        <w:t xml:space="preserve">   [SLIDE 20]</w:t>
       </w:r>
     </w:p>
     <w:p>
@@ -1361,7 +1156,7 @@
           <w:color w:val="1F4E9C"/>
           <w:sz w:val="32"/>
         </w:rPr>
-        <w:t xml:space="preserve">   [SLIDE 23]</w:t>
+        <w:t xml:space="preserve">   [SLIDE 21]</w:t>
       </w:r>
     </w:p>
     <w:p>
@@ -1399,7 +1194,7 @@
           <w:color w:val="1F4E9C"/>
           <w:sz w:val="32"/>
         </w:rPr>
-        <w:t xml:space="preserve">   [SLIDE 24]</w:t>
+        <w:t xml:space="preserve">   [SLIDE 22]</w:t>
       </w:r>
     </w:p>
     <w:p>
@@ -1437,7 +1232,7 @@
           <w:color w:val="1F4E9C"/>
           <w:sz w:val="32"/>
         </w:rPr>
-        <w:t xml:space="preserve">   [SLIDE 25]</w:t>
+        <w:t xml:space="preserve">   [SLIDE 23]</w:t>
       </w:r>
     </w:p>
     <w:p>
@@ -1475,7 +1270,7 @@
           <w:color w:val="1F4E9C"/>
           <w:sz w:val="32"/>
         </w:rPr>
-        <w:t xml:space="preserve">   [SLIDE 26]</w:t>
+        <w:t xml:space="preserve">   [SLIDE 24]</w:t>
       </w:r>
     </w:p>
     <w:p>
@@ -1513,7 +1308,7 @@
           <w:color w:val="1F4E9C"/>
           <w:sz w:val="32"/>
         </w:rPr>
-        <w:t xml:space="preserve">   [SLIDE 27]</w:t>
+        <w:t xml:space="preserve">   [SLIDE 25]</w:t>
       </w:r>
     </w:p>
     <w:p>
@@ -1551,7 +1346,7 @@
           <w:color w:val="1F4E9C"/>
           <w:sz w:val="32"/>
         </w:rPr>
-        <w:t xml:space="preserve">   [SLIDE 28]</w:t>
+        <w:t xml:space="preserve">   [SLIDE 26]</w:t>
       </w:r>
     </w:p>
     <w:p>
@@ -1589,7 +1384,7 @@
           <w:color w:val="1F4E9C"/>
           <w:sz w:val="32"/>
         </w:rPr>
-        <w:t xml:space="preserve">   [SLIDE 29]</w:t>
+        <w:t xml:space="preserve">   [SLIDE 27]</w:t>
       </w:r>
     </w:p>
     <w:p>
@@ -1652,7 +1447,7 @@
           <w:color w:val="1F4E9C"/>
           <w:sz w:val="32"/>
         </w:rPr>
-        <w:t xml:space="preserve">   [SLIDE 30]</w:t>
+        <w:t xml:space="preserve">   [SLIDE 28]</w:t>
       </w:r>
     </w:p>
     <w:p>

</xml_diff>

<commit_message>
Restore 2 slides per Tom's amendment (30 Aug): insert 'The Human Cost, In Numbers' stats slide as new slide 3 (after the North-South Bridge slide), and restore 'We Are Too Reactive' as new slide 19 (between NCISRM Level Four and Level Five) to restate the enormity of the problem before the citizen level. Deck grows from 24 to 26 slides. Renumbered all subsequent slide badges/footers/dropdown entries/[SLIDE N] script labels across HTML, PPTX and DOCX to stay in sync. Also fixed a pre-existing stale '/28' footer bug on 5 early PPTX slides left over from an older rebuild.
</commit_message>
<xml_diff>
--- a/avm_morgan_docs/AVM_MORGAN_SECURITY_KEYNOTE_ADDRESS_V4_MOD_AUG31.docx
+++ b/avm_morgan_docs/AVM_MORGAN_SECURITY_KEYNOTE_ADDRESS_V4_MOD_AUG31.docx
@@ -132,7 +132,34 @@
         <w:rPr>
           <w:color w:val="FF0000"/>
         </w:rPr>
-        <w:t>SECTION TWO: THE CRITICAL QUESTION — FRAGMENTATION, NOT ABSENCE   [SLIDE 3]</w:t>
+        <w:t>OPENING — THE SCALE OF THE CRISIS: THE HUMAN COST, IN NUMBERS   [SLIDE 3]</w:t>
+      </w:r>
+    </w:p>
+    <w:p>
+      <w:r>
+        <w:t>Before we go further, let us be precise about what is at stake. In Plateau State, December 2023, over 140 people were killed. In Benue State, between May 2023 and 2025, 1,043 people were killed. In a single night, in Yelwata, 160 people were killed.</w:t>
+      </w:r>
+    </w:p>
+    <w:p>
+      <w:r>
+        <w:t>As of December 2024, 500,182 people were displaced into camps in Benue State alone. Combining the North-Central and North-West, as of October 2025, the internally displaced population stood at 1,378,124. Nine individuals have so far been charged with terrorism in connection with the Yelwata killings.</w:t>
+      </w:r>
+    </w:p>
+    <w:p>
+      <w:r>
+        <w:t>These are not abstractions. They are the reason this keynote exists, and they are the scale we must measure every recommendation that follows against.</w:t>
+      </w:r>
+    </w:p>
+    <w:p/>
+    <w:p>
+      <w:pPr>
+        <w:pStyle w:val="Heading1"/>
+      </w:pPr>
+      <w:r>
+        <w:rPr>
+          <w:color w:val="FF0000"/>
+        </w:rPr>
+        <w:t>SECTION TWO: THE CRITICAL QUESTION — FRAGMENTATION, NOT ABSENCE   [SLIDE 4]</w:t>
       </w:r>
     </w:p>
     <w:p>
@@ -160,7 +187,7 @@
         <w:rPr>
           <w:color w:val="FF0000"/>
         </w:rPr>
-        <w:t>SECTION THREE: COLLABORATION AS THE CENTREPIECE   [SLIDE 4]</w:t>
+        <w:t>SECTION THREE: COLLABORATION AS THE CENTREPIECE   [SLIDE 5]</w:t>
       </w:r>
     </w:p>
     <w:p>
@@ -180,7 +207,7 @@
         <w:rPr>
           <w:color w:val="FF0000"/>
         </w:rPr>
-        <w:t>SECTION FOUR: FOUR SHIFTS THE NORTH-CENTRAL MUST MAKE   [SLIDE 5]</w:t>
+        <w:t>SECTION FOUR: FOUR SHIFTS THE NORTH-CENTRAL MUST MAKE   [SLIDE 6]</w:t>
       </w:r>
     </w:p>
     <w:p>
@@ -200,7 +227,7 @@
         <w:rPr>
           <w:color w:val="FF0000"/>
         </w:rPr>
-        <w:t>SECTION FIVE: LESSONS FROM ISRAEL AND BRITAIN — TOWARD A NIGERIAN MODEL   [SLIDE 6]</w:t>
+        <w:t>SECTION FIVE: LESSONS FROM ISRAEL AND BRITAIN — TOWARD A NIGERIAN MODEL   [SLIDE 7]</w:t>
       </w:r>
     </w:p>
     <w:p>
@@ -220,7 +247,7 @@
         <w:rPr>
           <w:color w:val="FF0000"/>
         </w:rPr>
-        <w:t>SECTION SIX: THE CENTRAL QUESTION — TWO MODELS TO LEARN FROM   [SLIDE 7]</w:t>
+        <w:t>SECTION SIX: THE CENTRAL QUESTION — TWO MODELS TO LEARN FROM   [SLIDE 8]</w:t>
       </w:r>
     </w:p>
     <w:p>
@@ -256,7 +283,7 @@
         <w:rPr>
           <w:color w:val="FF0000"/>
         </w:rPr>
-        <w:t>SECTION SEVEN: THE ISRAELI MODEL — WHOLE-OF-NATION INTEGRATION   [SLIDE 8]</w:t>
+        <w:t>SECTION SEVEN: THE ISRAELI MODEL — WHOLE-OF-NATION INTEGRATION   [SLIDE 9]</w:t>
       </w:r>
     </w:p>
     <w:p>
@@ -292,7 +319,7 @@
         <w:rPr>
           <w:color w:val="FF0000"/>
         </w:rPr>
-        <w:t>SECTION EIGHT: THE ISRAELI MODEL — THE CITIZEN AS SENSOR   [SLIDE 9]</w:t>
+        <w:t>SECTION EIGHT: THE ISRAELI MODEL — THE CITIZEN AS SENSOR   [SLIDE 10]</w:t>
       </w:r>
     </w:p>
     <w:p>
@@ -320,7 +347,7 @@
         <w:rPr>
           <w:color w:val="FF0000"/>
         </w:rPr>
-        <w:t>SECTION NINE: FIVE LESSONS ISRAEL OFFERS NORTH-CENTRAL NIGERIA   [SLIDE 10]</w:t>
+        <w:t>SECTION NINE: FIVE LESSONS ISRAEL OFFERS NORTH-CENTRAL NIGERIA   [SLIDE 11]</w:t>
       </w:r>
     </w:p>
     <w:p>
@@ -348,7 +375,7 @@
         <w:rPr>
           <w:color w:val="FF0000"/>
         </w:rPr>
-        <w:t>SECTION TEN: THE UK MODEL — CONTEST AND COORDINATED POLICING   [SLIDE 11]</w:t>
+        <w:t>SECTION TEN: THE UK MODEL — CONTEST AND COORDINATED POLICING   [SLIDE 12]</w:t>
       </w:r>
     </w:p>
     <w:p>
@@ -376,7 +403,7 @@
         <w:rPr>
           <w:color w:val="FF0000"/>
         </w:rPr>
-        <w:t>SECTION ELEVEN: THE UK MODEL — THE LESSON FOR NIGERIA   [SLIDE 12]</w:t>
+        <w:t>SECTION ELEVEN: THE UK MODEL — THE LESSON FOR NIGERIA   [SLIDE 13]</w:t>
       </w:r>
     </w:p>
     <w:p>
@@ -404,7 +431,7 @@
         <w:rPr>
           <w:color w:val="FF0000"/>
         </w:rPr>
-        <w:t>SECTION TWELVE: ISRAEL VS UK — A QUICK COMPARISON   [SLIDE 13]</w:t>
+        <w:t>SECTION TWELVE: ISRAEL VS UK — A QUICK COMPARISON   [SLIDE 14]</w:t>
       </w:r>
     </w:p>
     <w:p>
@@ -1032,7 +1059,7 @@
         <w:rPr>
           <w:color w:val="FF0000"/>
         </w:rPr>
-        <w:t>SECTION THIRTEEN: THE HYBRID MODEL — THE NCISRM   [SLIDE 14]</w:t>
+        <w:t>SECTION THIRTEEN: THE HYBRID MODEL — THE NCISRM   [SLIDE 15]</w:t>
       </w:r>
     </w:p>
     <w:p>
@@ -1060,7 +1087,7 @@
         <w:rPr>
           <w:color w:val="FF0000"/>
         </w:rPr>
-        <w:t>SECTION FOURTEEN: NCISRM LEVELS ONE AND TWO — REGIONAL FUSION AND STATE COORDINATION   [SLIDE 15]</w:t>
+        <w:t>SECTION FOURTEEN: NCISRM LEVELS ONE AND TWO — REGIONAL FUSION AND STATE COORDINATION   [SLIDE 16]</w:t>
       </w:r>
     </w:p>
     <w:p>
@@ -1088,7 +1115,7 @@
         <w:rPr>
           <w:color w:val="FF0000"/>
         </w:rPr>
-        <w:t>SECTION FIFTEEN: NCISRM LEVEL THREE — THE LOCAL SECURITY NETWORK   [SLIDE 16]</w:t>
+        <w:t>SECTION FIFTEEN: NCISRM LEVEL THREE — THE LOCAL SECURITY NETWORK   [SLIDE 17]</w:t>
       </w:r>
     </w:p>
     <w:p>
@@ -1116,7 +1143,7 @@
         <w:rPr>
           <w:color w:val="FF0000"/>
         </w:rPr>
-        <w:t>SECTION SIXTEEN: NCISRM LEVEL FOUR — THE FOREST AND RURAL SECURITY LAYER   [SLIDE 17]</w:t>
+        <w:t>SECTION SIXTEEN: NCISRM LEVEL FOUR — THE FOREST AND RURAL SECURITY LAYER   [SLIDE 18]</w:t>
       </w:r>
     </w:p>
     <w:p>
@@ -1136,7 +1163,34 @@
         <w:rPr>
           <w:color w:val="FF0000"/>
         </w:rPr>
-        <w:t>SECTION SEVENTEEN: NCISRM LEVEL FIVE — THE CITIZEN   [SLIDE 18]</w:t>
+        <w:t>THE CENTRAL PROBLEM, RESTATED — WE ARE TOO REACTIVE   [SLIDE 19]</w:t>
+      </w:r>
+    </w:p>
+    <w:p>
+      <w:r>
+        <w:t>Before we complete the NCISRM's five levels with the citizen, it is worth pausing to restate, plainly, the enormity of the problem we are solving for.</w:t>
+      </w:r>
+    </w:p>
+    <w:p>
+      <w:r>
+        <w:t>An attack occurs. People are killed. Police are alerted. The military is mobilised. The attackers vanish. The community is searched. We wait — and then the cycle repeats.</w:t>
+      </w:r>
+    </w:p>
+    <w:p>
+      <w:r>
+        <w:t>No amount of additional manpower fixes a cycle that is structurally reactive. This is the scale we must design our way out of, not simply police our way out of. That is precisely why the final level of this model — the citizen — matters so much.</w:t>
+      </w:r>
+    </w:p>
+    <w:p/>
+    <w:p>
+      <w:pPr>
+        <w:pStyle w:val="Heading1"/>
+      </w:pPr>
+      <w:r>
+        <w:rPr>
+          <w:color w:val="FF0000"/>
+        </w:rPr>
+        <w:t>SECTION SEVENTEEN: NCISRM LEVEL FIVE — THE CITIZEN   [SLIDE 20]</w:t>
       </w:r>
     </w:p>
     <w:p>
@@ -1156,7 +1210,7 @@
         <w:rPr>
           <w:color w:val="FF0000"/>
         </w:rPr>
-        <w:t>SECTION EIGHTEEN: THE ROLE OF VETERANS — THE NORTH-CENTRAL ADVANTAGE   [SLIDE 19]</w:t>
+        <w:t>SECTION EIGHTEEN: THE ROLE OF VETERANS — THE NORTH-CENTRAL ADVANTAGE   [SLIDE 21]</w:t>
       </w:r>
     </w:p>
     <w:p>
@@ -1184,7 +1238,7 @@
         <w:rPr>
           <w:color w:val="FF0000"/>
         </w:rPr>
-        <w:t>SECTION NINETEEN: FROM REACTION TO PREVENTION — THE FIFTH P   [SLIDE 20]</w:t>
+        <w:t>SECTION NINETEEN: FROM REACTION TO PREVENTION — THE FIFTH P   [SLIDE 22]</w:t>
       </w:r>
     </w:p>
     <w:p>
@@ -1212,7 +1266,7 @@
         <w:rPr>
           <w:color w:val="FF0000"/>
         </w:rPr>
-        <w:t>SECTION TWENTY: CONCLUSION — THREE LESSONS, ONE SYSTEM   [SLIDE 21]</w:t>
+        <w:t>SECTION TWENTY: CONCLUSION — THREE LESSONS, ONE SYSTEM   [SLIDE 23]</w:t>
       </w:r>
     </w:p>
     <w:p>
@@ -1248,7 +1302,7 @@
         <w:rPr>
           <w:color w:val="FF0000"/>
         </w:rPr>
-        <w:t>SECTION TWENTY-ONE: CONCLUSION — THE NIGERIAN COMMITMENTS   [SLIDE 22]</w:t>
+        <w:t>SECTION TWENTY-ONE: CONCLUSION — THE NIGERIAN COMMITMENTS   [SLIDE 24]</w:t>
       </w:r>
     </w:p>
     <w:p>
@@ -1268,7 +1322,7 @@
         <w:rPr>
           <w:color w:val="FF0000"/>
         </w:rPr>
-        <w:t>CLOSING — THE ULTIMATE OBJECTIVE   [SLIDE 23]</w:t>
+        <w:t>CLOSING — THE ULTIMATE OBJECTIVE   [SLIDE 25]</w:t>
       </w:r>
     </w:p>
     <w:p>
@@ -1312,7 +1366,7 @@
         <w:rPr>
           <w:color w:val="FF0000"/>
         </w:rPr>
-        <w:t>REFERENCES   [SLIDE 24]</w:t>
+        <w:t>REFERENCES   [SLIDE 26]</w:t>
       </w:r>
     </w:p>
     <w:p>

</xml_diff>

<commit_message>
Add closing recommendation to slide 25: North-Central Security Endowment Fund, jointly financed by Federal Government and North-Central Governors, transparent governance and sustainable funding. Applied to HTML, PPTX (with autofit to prevent overflow) and DOCX script. Regenerated PDF export.
</commit_message>
<xml_diff>
--- a/avm_morgan_docs/AVM_MORGAN_SECURITY_KEYNOTE_ADDRESS_V4_MOD_AUG31.docx
+++ b/avm_morgan_docs/AVM_MORGAN_SECURITY_KEYNOTE_ADDRESS_V4_MOD_AUG31.docx
@@ -1339,6 +1339,11 @@
           <w:color w:val="FF0000"/>
         </w:rPr>
         <w:t>That, in my view, is the model most suited to securing the North-Central region — and potentially a prototype for a new collaborative security architecture for Nigeria.</w:t>
+      </w:r>
+    </w:p>
+    <w:p>
+      <w:r>
+        <w:t>Finally, I recommend the establishment of a North-Central Security Endowment Fund, jointly financed by the Federal Government and the North-Central Governors, with transparent governance and sustainable funding to meet the significant financial requirements of implementing this new security architecture.</w:t>
       </w:r>
     </w:p>
     <w:p>

</xml_diff>